<commit_message>
Se revisa y actuliza CV 2026
Se revisa y actuliza CV 2026
</commit_message>
<xml_diff>
--- a/Marco-Gonzalez-CV.docx
+++ b/Marco-Gonzalez-CV.docx
@@ -1,23 +1,21 @@
 
 <file path=word/document.xml><?xml version="1.0" encoding="utf-8"?>
-<w:document xmlns:ve="http://schemas.openxmlformats.org/markup-compatibility/2006" xmlns:o="urn:schemas-microsoft-com:office:office" xmlns:r="http://schemas.openxmlformats.org/officeDocument/2006/relationships" xmlns:m="http://schemas.openxmlformats.org/officeDocument/2006/math" xmlns:v="urn:schemas-microsoft-com:vml" xmlns:wp="http://schemas.openxmlformats.org/drawingml/2006/wordprocessingDrawing" xmlns:w10="urn:schemas-microsoft-com:office:word" xmlns:w="http://schemas.openxmlformats.org/wordprocessingml/2006/main" xmlns:wne="http://schemas.microsoft.com/office/word/2006/wordml">
+<w:document xmlns:wpc="http://schemas.microsoft.com/office/word/2010/wordprocessingCanvas" xmlns:mo="http://schemas.microsoft.com/office/mac/office/2008/main" xmlns:mc="http://schemas.openxmlformats.org/markup-compatibility/2006" xmlns:mv="urn:schemas-microsoft-com:mac:vml" xmlns:o="urn:schemas-microsoft-com:office:office" xmlns:r="http://schemas.openxmlformats.org/officeDocument/2006/relationships" xmlns:m="http://schemas.openxmlformats.org/officeDocument/2006/math" xmlns:v="urn:schemas-microsoft-com:vml" xmlns:wp14="http://schemas.microsoft.com/office/word/2010/wordprocessingDrawing" xmlns:wp="http://schemas.openxmlformats.org/drawingml/2006/wordprocessingDrawing" xmlns:w10="urn:schemas-microsoft-com:office:word" xmlns:w="http://schemas.openxmlformats.org/wordprocessingml/2006/main" xmlns:w14="http://schemas.microsoft.com/office/word/2010/wordml" xmlns:wpg="http://schemas.microsoft.com/office/word/2010/wordprocessingGroup" xmlns:wpi="http://schemas.microsoft.com/office/word/2010/wordprocessingInk" xmlns:wne="http://schemas.microsoft.com/office/word/2006/wordml" xmlns:wps="http://schemas.microsoft.com/office/word/2010/wordprocessingShape" mc:Ignorable="w14 wp14">
   <w:body>
     <w:p>
       <w:pPr>
-        <w:spacing w:after="20"/>
         <w:jc w:val="center"/>
       </w:pPr>
       <w:r>
         <w:rPr>
           <w:b/>
-          <w:sz w:val="34"/>
+          <w:sz w:val="36"/>
         </w:rPr>
         <w:t>MARCO A. GONZÁLEZ OBREGÓN</w:t>
       </w:r>
     </w:p>
     <w:p>
       <w:pPr>
-        <w:spacing w:after="20"/>
         <w:jc w:val="center"/>
       </w:pPr>
       <w:r>
@@ -25,38 +23,67 @@
           <w:b/>
           <w:sz w:val="20"/>
         </w:rPr>
-        <w:t>DIRECTOR / GERENTE DE DESARROLLO DE SOFTWARE | ENGINEERING LEADER</w:t>
+        <w:t>DIRECTOR / GERENTE DE DESARROLLO DE SOFTWARE | ARQUITECTURA DE SOLUCIONES</w:t>
       </w:r>
     </w:p>
     <w:p>
       <w:pPr>
-        <w:spacing w:after="60"/>
         <w:jc w:val="center"/>
       </w:pPr>
       <w:r>
-        <w:t>Ciudad de México | marco4780@hotmail.com |</w:t>
+        <w:rPr>
+          <w:sz w:val="17"/>
+        </w:rPr>
+        <w:t>Ciudad de México, México  |  marco4780@hotmail.com  |  Inglés: Intermedio Alto</w:t>
       </w:r>
+    </w:p>
+    <w:p>
+      <w:pPr>
+        <w:spacing w:before="140" w:after="60"/>
+      </w:pPr>
       <w:r>
-        <w:t xml:space="preserve"> mobile: 55 27 23 70 92|</w:t>
+        <w:rPr>
+          <w:b/>
+          <w:sz w:val="22"/>
+        </w:rPr>
+        <w:t>PERFIL PROFESIONAL</w:t>
       </w:r>
+    </w:p>
+    <w:p>
+      <w:pPr>
+        <w:spacing w:after="80"/>
+      </w:pPr>
       <w:r>
-        <w:t xml:space="preserve"> </w:t>
+        <w:t>Líder tecnológico con más de 20 años de experiencia en desarrollo de software, arquitectura de soluciones y transformación digital. He liderado equipos multidisciplinarios y proyectos de principio a fin, conectando tecnología, operación y objetivos de negocio. Experiencia en modernización de plataformas, Cloud, microservicios, integración, DevOps e Inteligencia Artificial, trabajando con AWS, Azure y Google Cloud. Trayectoria en los sectores financiero, gobierno, retail, medios y empresas privadas.</w:t>
       </w:r>
-      <w:proofErr w:type="spellStart"/>
+    </w:p>
+    <w:p>
+      <w:pPr>
+        <w:spacing w:before="140" w:after="60"/>
+      </w:pPr>
       <w:r>
-        <w:t>Inglés</w:t>
+        <w:rPr>
+          <w:b/>
+          <w:sz w:val="22"/>
+        </w:rPr>
+        <w:t>COMPETENCIAS CLAVE</w:t>
       </w:r>
-      <w:proofErr w:type="spellEnd"/>
+    </w:p>
+    <w:p>
       <w:r>
-        <w:t xml:space="preserve">: </w:t>
+        <w:t>Liderazgo de equipos · Gerencia de Desarrollo · Arquitectura de Software · Estrategia tecnológica · Transformación Digital · Gestión de Proyectos · Cloud Computing · AWS · Azure · Google Cloud · Microservicios · APIs/REST · DevOps/CI/CD · Serverless · Inteligencia Artificial · Integración de Sistemas · Modernización · Agile/Scrum/Kanban · Stakeholder Management</w:t>
       </w:r>
-      <w:proofErr w:type="spellStart"/>
+    </w:p>
+    <w:p>
+      <w:pPr>
+        <w:spacing w:before="140" w:after="60"/>
+      </w:pPr>
       <w:r>
-        <w:t>Intermedio</w:t>
-      </w:r>
-      <w:proofErr w:type="spellEnd"/>
-      <w:r>
-        <w:t xml:space="preserve"> Alto</w:t>
+        <w:rPr>
+          <w:b/>
+          <w:sz w:val="22"/>
+        </w:rPr>
+        <w:t>EXPERIENCIA PROFESIONAL</w:t>
       </w:r>
     </w:p>
     <w:p>
@@ -66,17 +93,38 @@
       <w:r>
         <w:rPr>
           <w:b/>
-          <w:sz w:val="21"/>
+          <w:sz w:val="19"/>
         </w:rPr>
-        <w:t>PERFIL PROFESIONAL</w:t>
+        <w:t>Konesh · Proyecto: PepsiCo</w:t>
+      </w:r>
+      <w:r>
+        <w:rPr>
+          <w:b/>
+          <w:sz w:val="19"/>
+        </w:rPr>
+        <w:t xml:space="preserve"> — Ingeniero de Software | May 2026 – Ago 2026</w:t>
+      </w:r>
+    </w:p>
+    <w:p>
+      <w:pPr>
+        <w:spacing w:after="20"/>
+        <w:ind w:left="216"/>
+      </w:pPr>
+      <w:r>
+        <w:t>Participación en la atención y resolución de requerimientos para el Sistema de Proveedores de PepsiCo.</w:t>
+        <w:br/>
+        <w:t xml:space="preserve">        Análisis y entendimiento de la funcionalidad existente para identificar impactos y ejecutar soluciones.</w:t>
+        <w:br/>
+        <w:t xml:space="preserve">        Atención de 7 requerimientos puntuales, contribuyendo al cumplimiento de objetivos y entregables del proyecto.</w:t>
       </w:r>
     </w:p>
     <w:p>
       <w:pPr>
         <w:spacing w:after="40"/>
+        <w:ind w:left="216"/>
       </w:pPr>
       <w:r>
-        <w:t>Ejecutivo de tecnología y líder de software con más de 20 años de experiencia en desarrollo, arquitectura, liderazgo técnico y gestión de equipos. Experiencia como Gerente de Desarrollo de Software, Tech Lead, Arquitecto y Consultor, liderando proyectos de modernización, evolución de plataformas y transformación digital. Combino estrategia tecnológica, arquitectura y gestión con experiencia en Cloud Computing (AWS, Azure y Google Cloud), microservicios, APIs, DevOps, CI/CD, Serverless e Inteligencia Artificial. Trayectoria en sectores financiero, gobierno, retail, medios y empresas privadas.</w:t>
+        <w:t>Tecnologías: Angular · Grails · MySQL · Frontend · Backend · Requerimientos · Análisis</w:t>
       </w:r>
     </w:p>
     <w:p>
@@ -86,17 +134,34 @@
       <w:r>
         <w:rPr>
           <w:b/>
-          <w:sz w:val="21"/>
+          <w:sz w:val="19"/>
         </w:rPr>
-        <w:t>COMPETENCIAS CLAVE</w:t>
+        <w:t>IDS · Entidad Financiera</w:t>
+      </w:r>
+      <w:r>
+        <w:rPr>
+          <w:b/>
+          <w:sz w:val="19"/>
+        </w:rPr>
+        <w:t xml:space="preserve"> — Integrador Tecnológico — Tech Lead | Abr 2024 – Mar 2025</w:t>
+      </w:r>
+    </w:p>
+    <w:p>
+      <w:pPr>
+        <w:spacing w:after="20"/>
+        <w:ind w:left="216"/>
+      </w:pPr>
+      <w:r>
+        <w:t>Diseño, optimización e integración de tecnologías y arquitecturas de software. Análisis del modelo de negocio y propuesta de soluciones alineadas con necesidades, presupuesto y expectativas. Liderazgo de equipos multidisciplinarios, planes de trabajo, historias de usuario, arquitectura, desarrollo y testing. Optimización del proceso de cobro automático y automatización/mejora del proceso de crédito hipotecario.</w:t>
       </w:r>
     </w:p>
     <w:p>
       <w:pPr>
         <w:spacing w:after="40"/>
+        <w:ind w:left="216"/>
       </w:pPr>
       <w:r>
-        <w:t>Liderazgo de equipos | Gerencia de Desarrollo | Arquitectura de Software | Estrategia tecnológica | Transformación Digital | Gestión de Proyectos | Cloud Computing | AWS | Azure | Google Cloud | Microservicios | APIs/REST | DevOps/CI/CD | Kubernetes | Integración de Sistemas | Modernización | Agile/Scrum/Kanban | Stakeholder Management | IA</w:t>
+        <w:t>Tecnologías: Mainframes · .NET · Java · REST APIs · Git / GitHub · CI/CD · Jira · Confluence · Scrum · Kanban · SoapUI</w:t>
       </w:r>
     </w:p>
     <w:p>
@@ -106,530 +171,34 @@
       <w:r>
         <w:rPr>
           <w:b/>
-          <w:sz w:val="21"/>
+          <w:sz w:val="19"/>
         </w:rPr>
-        <w:t>EXPERIENCIA PROFESIONAL</w:t>
+        <w:t>VIVARO Digital</w:t>
       </w:r>
-    </w:p>
-    <w:p>
-      <w:pPr>
-        <w:spacing w:before="40" w:after="6"/>
-      </w:pPr>
       <w:r>
         <w:rPr>
           <w:b/>
-          <w:sz w:val="17"/>
+          <w:sz w:val="19"/>
         </w:rPr>
-        <w:t>Integrador Tecnológico (Tech Lead) | IDS</w:t>
-      </w:r>
-      <w:r>
-        <w:t xml:space="preserve"> | Abr 2024 – Mar 2025</w:t>
+        <w:t xml:space="preserve"> — Desarrollo de Software y Arquitecturas en la Nube | Dic 2020 – Feb 2024</w:t>
       </w:r>
     </w:p>
     <w:p>
       <w:pPr>
         <w:spacing w:after="20"/>
+        <w:ind w:left="216"/>
       </w:pPr>
       <w:r>
-        <w:rPr>
-          <w:sz w:val="15"/>
-        </w:rPr>
-        <w:t>Entidad financiera. Diseño, optimización e integración de tecnologías y arquitecturas de software; análisis del modelo de negocio y propuesta de soluciones alineadas con necesidades, presupuesto y expectativas. Liderazgo de equipos multidisciplinarios, planes de trabajo, historias de usuario, arquitectura, desarrollo y testing. Optimización del proceso de cobro automático y automatización/mejora del proceso de crédito hipotecario. Scrum, Kanban, Jira, Confluence, SoapUI, REST, .NET, Java, Git, GitHub, CI/CD y microservicios.</w:t>
+        <w:t>Manejo de proyectos y equipos técnicos; análisis y asignación de requerimientos y coordinación con testers, desarrolladores, arquitectos, analistas y documentación. Diseño de arquitecturas Cloud, móviles y digitales; Serverless, IA, microservicios, APIs, seguridad e infraestructura como código. Soluciones Web, Mobile, Cloud, Streaming/OTT, plataformas de cobro y analítica. AWS, Azure y Google Cloud.</w:t>
       </w:r>
     </w:p>
     <w:p>
       <w:pPr>
-        <w:spacing w:before="40" w:after="6"/>
+        <w:spacing w:after="40"/>
+        <w:ind w:left="216"/>
       </w:pPr>
       <w:r>
-        <w:rPr>
-          <w:b/>
-          <w:sz w:val="17"/>
-        </w:rPr>
-        <w:t>Desarrollo de Software y Arquitecturas en la Nube | VIVARO Digital</w:t>
-      </w:r>
-      <w:r>
-        <w:t xml:space="preserve"> | Dic 2020 – Feb 2024</w:t>
-      </w:r>
-    </w:p>
-    <w:p>
-      <w:pPr>
-        <w:spacing w:after="20"/>
-      </w:pPr>
-      <w:r>
-        <w:rPr>
-          <w:sz w:val="15"/>
-        </w:rPr>
-        <w:t>Gobierno de México / organizaciones privadas. Manejo de proyectos y equipos técnicos; análisis y asignación de requerimientos y coordinación con testers, desarrolladores, arquitectos, analistas y documentación. Arquitecturas Cloud, móviles y digitales; Serverless, IA, microservicios, APIs, seguridad e infraestructura como código. Soluciones Web, Mobile, Cloud, Streaming/OTT, plataformas de cobro y analítica. AWS, Azure, Google Cloud, JavaScript, Python, Angular, Vue, React, Ionic, Flutter, Machine Learning y CI/CD.</w:t>
-      </w:r>
-    </w:p>
-    <w:p>
-      <w:pPr>
-        <w:spacing w:before="40" w:after="6"/>
-      </w:pPr>
-      <w:r>
-        <w:rPr>
-          <w:b/>
-          <w:sz w:val="17"/>
-        </w:rPr>
-        <w:t>Gerente de Desarrollo de Software | Modatelas S.A.P.I. de C.V.</w:t>
-      </w:r>
-      <w:r>
-        <w:t xml:space="preserve"> | Ene 2017 – Abr 2020</w:t>
-      </w:r>
-    </w:p>
-    <w:p>
-      <w:pPr>
-        <w:spacing w:after="20"/>
-      </w:pPr>
-      <w:r>
-        <w:rPr>
-          <w:sz w:val="15"/>
-        </w:rPr>
-        <w:t>Retail / ERP / SAP / Punto de Venta. Responsable del área de Desarrollo de Software, presupuesto, arquitectura, mantenimiento, nuevos sistemas y migración de aplicativos. Administración de personal de TI: técnicos, consultores, líderes, arquitectos, programadores y analistas. Gestión de requerimientos de inicio a fin. Interfaces ERP, SAP y punto de venta, tableros y dashboards. Planes, metas y alcances. Transformación Digital, Innovación, automatización y modernización.</w:t>
-      </w:r>
-    </w:p>
-    <w:p>
-      <w:pPr>
-        <w:spacing w:before="40" w:after="6"/>
-      </w:pPr>
-      <w:r>
-        <w:rPr>
-          <w:b/>
-          <w:sz w:val="17"/>
-        </w:rPr>
-        <w:t>Consultor .NET y Android | Grupo Perti</w:t>
-      </w:r>
-      <w:r>
-        <w:t xml:space="preserve"> | Mar 2016 – Ene 2017</w:t>
-      </w:r>
-    </w:p>
-    <w:p>
-      <w:pPr>
-        <w:spacing w:after="20"/>
-      </w:pPr>
-      <w:r>
-        <w:rPr>
-          <w:sz w:val="15"/>
-        </w:rPr>
-        <w:t>B&amp;P. Proyecto para captura de información en tiempo real, gestión y geolocalización de empresas, sucursales, formularios y proyectos dinámicos. Análisis de RFP y requerimientos, diseño y programación Android/Web, Front End y Back End, diagramas y arquitectura. Equipo de 5 personas. .NET 4.6, SQL Server 2016, Entity Framework 6, JSON, Android 7, AngularJS, Web API 2, Bootstrap y Xamarin.</w:t>
-      </w:r>
-    </w:p>
-    <w:p>
-      <w:pPr>
-        <w:spacing w:before="40" w:after="6"/>
-      </w:pPr>
-      <w:r>
-        <w:rPr>
-          <w:b/>
-          <w:sz w:val="17"/>
-        </w:rPr>
-        <w:t>Consultor .NET | Deintec</w:t>
-      </w:r>
-      <w:r>
-        <w:t xml:space="preserve"> | Ene 2015 – Mar 2016</w:t>
-      </w:r>
-    </w:p>
-    <w:p>
-      <w:pPr>
-        <w:spacing w:after="20"/>
-      </w:pPr>
-      <w:r>
-        <w:rPr>
-          <w:sz w:val="15"/>
-        </w:rPr>
-        <w:t>Conpaq / Televisa / Banco Bansi. Desarrollo de aplicaciones Web y móviles y participación como Arquitecto de Aplicaciones. Control de equipos y diseño con patrones y arquitectura por capas. ASP.NET, MVC, Bootstrap, Xamarin, jQuery, JSON, JavaScript, CSS, C#, Java, XML, XSD, SQL Server, SQLite, Windows Mobile, iOS, Android, WCF y Servicios Web. Agile, Scrum, PMBOK e ITIL.</w:t>
-      </w:r>
-    </w:p>
-    <w:p>
-      <w:pPr>
-        <w:spacing w:before="40" w:after="6"/>
-      </w:pPr>
-      <w:r>
-        <w:rPr>
-          <w:b/>
-          <w:sz w:val="17"/>
-        </w:rPr>
-        <w:t>Consultor Sr. .NET | Hosting Business</w:t>
-      </w:r>
-      <w:r>
-        <w:t xml:space="preserve"> | Ene 2014 – Nov 2014</w:t>
-      </w:r>
-    </w:p>
-    <w:p>
-      <w:pPr>
-        <w:spacing w:after="20"/>
-      </w:pPr>
-      <w:r>
-        <w:rPr>
-          <w:sz w:val="15"/>
-        </w:rPr>
-        <w:t>Cliente: Banco Azteca. Migración de pantallas ASP a ASP.NET; programas de consola y escritorio para extracción de información; migración de queries a funciones Oracle; desarrollo de pantallas SOAC; desarrollo y consumo de Web Services y requerimientos de inicio a fin. Visual Studio 2010/2013, SOAP, SQL, AS400, C#, AJAX y jQuery.</w:t>
-      </w:r>
-    </w:p>
-    <w:p>
-      <w:pPr>
-        <w:spacing w:before="40" w:after="6"/>
-      </w:pPr>
-      <w:r>
-        <w:rPr>
-          <w:b/>
-          <w:sz w:val="17"/>
-        </w:rPr>
-        <w:t>Desarrollador Sr. / Integrador Tecnológico | Softtek</w:t>
-      </w:r>
-      <w:r>
-        <w:t xml:space="preserve"> | Mar 2013 – Ene 2014</w:t>
-      </w:r>
-    </w:p>
-    <w:p>
-      <w:pPr>
-        <w:spacing w:after="20"/>
-      </w:pPr>
-      <w:r>
-        <w:rPr>
-          <w:sz w:val="15"/>
-        </w:rPr>
-        <w:t>Cliente: Banamex. Asignación en Banamex para migración de software de Windows XP a Windows 7. Evaluación de aplicaciones, análisis de software y código, planeación, ejecución de objetivos, negociación y comunicación con responsables de aplicaciones, mantenimiento y resolución de problemas. .NET, C#, VB.NET, Java, SQL Server, Oracle, Access, VB 6.0, LINQ, Visual Studio y Project.</w:t>
-      </w:r>
-    </w:p>
-    <w:p>
-      <w:pPr>
-        <w:spacing w:before="40" w:after="6"/>
-      </w:pPr>
-      <w:r>
-        <w:rPr>
-          <w:b/>
-          <w:sz w:val="17"/>
-        </w:rPr>
-        <w:t>Líder Técnico .NET | CE Consulting</w:t>
-      </w:r>
-      <w:r>
-        <w:t xml:space="preserve"> | Dic 2012 – Mar 2013</w:t>
-      </w:r>
-    </w:p>
-    <w:p>
-      <w:pPr>
-        <w:spacing w:after="20"/>
-      </w:pPr>
-      <w:r>
-        <w:rPr>
-          <w:sz w:val="15"/>
-        </w:rPr>
-        <w:t>Cliente: Televisa. Atención de requerimientos y manejo de equipo de trabajo, con 2 desarrolladores a cargo. Desarrollo de aplicaciones .NET y migración Java a .NET. Demos Android e iOS y desarrollo de ETLs. Oracle 11, SQL Server, Java y .NET; Visual Studio y JDeveloper.</w:t>
-      </w:r>
-    </w:p>
-    <w:p>
-      <w:pPr>
-        <w:spacing w:before="40" w:after="6"/>
-      </w:pPr>
-      <w:r>
-        <w:rPr>
-          <w:b/>
-          <w:sz w:val="17"/>
-        </w:rPr>
-        <w:t>Gerente de Desarrollo de Software | TSD</w:t>
-      </w:r>
-      <w:r>
-        <w:t xml:space="preserve"> | May 2012 – Dic 2012</w:t>
-      </w:r>
-    </w:p>
-    <w:p>
-      <w:pPr>
-        <w:spacing w:after="20"/>
-      </w:pPr>
-      <w:r>
-        <w:rPr>
-          <w:sz w:val="15"/>
-        </w:rPr>
-        <w:t>Sistemas propios / área de Desarrollo. Administración y control del área de Desarrollo de Software. Atención de requerimientos del área y sistemas propios. Implementación de mejoras y control de cambios y versiones mediante HelpDesk BMC. Desarrollo .NET y Java. Negociación con clientes internos y externos. Planeación y control de sistemas. Manejo de crisis y situaciones de presión.</w:t>
-      </w:r>
-    </w:p>
-    <w:p>
-      <w:pPr>
-        <w:spacing w:before="40" w:after="6"/>
-      </w:pPr>
-      <w:r>
-        <w:rPr>
-          <w:b/>
-          <w:sz w:val="17"/>
-        </w:rPr>
-        <w:t>Arquitecto .NET | ARRASA</w:t>
-      </w:r>
-      <w:r>
-        <w:t xml:space="preserve"> | Ene 2012 – May 2012</w:t>
-      </w:r>
-    </w:p>
-    <w:p>
-      <w:pPr>
-        <w:spacing w:after="20"/>
-      </w:pPr>
-      <w:r>
-        <w:rPr>
-          <w:sz w:val="15"/>
-        </w:rPr>
-        <w:t>Seguridad, controles de acceso y biometría. Diseño de arquitectura de aplicaciones de seguridad y controles de acceso. Desarrollo de Middleware. Arquitectura y diseño de servicios y desarrollo de Servicios Web. Aplicaciones biométricas de iris y huellas dactilares. Patrones de diseño .NET. C#, Oracle, Wiegand, ASP.NET, Silverlight 4 y C# 4.0.</w:t>
-      </w:r>
-    </w:p>
-    <w:p>
-      <w:pPr>
-        <w:spacing w:before="40" w:after="6"/>
-      </w:pPr>
-      <w:r>
-        <w:rPr>
-          <w:b/>
-          <w:sz w:val="17"/>
-        </w:rPr>
-        <w:t>Líder de Proyecto .NET | ATENTO</w:t>
-      </w:r>
-      <w:r>
-        <w:t xml:space="preserve"> | Oct 2011 – Ene 2012</w:t>
-      </w:r>
-    </w:p>
-    <w:p>
-      <w:pPr>
-        <w:spacing w:after="20"/>
-      </w:pPr>
-      <w:r>
-        <w:rPr>
-          <w:sz w:val="15"/>
-        </w:rPr>
-        <w:t>AutoExpressManager. Desarrollo de sistemas aplicando Scrum. Desarrollo en Silverlight y participación en AutoExpressManager. Proyecto temporal para concluir primera fase. Atención de requerimientos. Silverlight 4, WCF, WPF, C#, VB.NET, LINQ, Services, JavaScript, SQL Server 2008, Visual Studio 2010, SVN, RIA Services y RUP.</w:t>
-      </w:r>
-    </w:p>
-    <w:p>
-      <w:pPr>
-        <w:spacing w:before="40" w:after="6"/>
-      </w:pPr>
-      <w:r>
-        <w:rPr>
-          <w:b/>
-          <w:sz w:val="17"/>
-        </w:rPr>
-        <w:t>Consultor Sr. .NET | Hosting Business</w:t>
-      </w:r>
-      <w:r>
-        <w:t xml:space="preserve"> | Jun 2011 – Oct 2011</w:t>
-      </w:r>
-    </w:p>
-    <w:p>
-      <w:pPr>
-        <w:spacing w:after="20"/>
-      </w:pPr>
-      <w:r>
-        <w:rPr>
-          <w:sz w:val="15"/>
-        </w:rPr>
-        <w:lastRenderedPageBreak/>
-        <w:t>Cliente: Banco Azteca. Desarrollo en el Portal Banco Azteca, servicios REST y XML. Desarrollo con MVC y Silverlight, flujos de trabajo y soluciones para Windows Mobile y Android. Silverlight 4, WCF, WPF, C#, LINQ, Java, Services, Visual Studio 2010, RUP y MVVM.</w:t>
-      </w:r>
-    </w:p>
-    <w:p>
-      <w:pPr>
-        <w:spacing w:before="40" w:after="6"/>
-      </w:pPr>
-      <w:r>
-        <w:rPr>
-          <w:b/>
-          <w:sz w:val="17"/>
-        </w:rPr>
-        <w:t>Consultor Sr. .NET | MAPDATA</w:t>
-      </w:r>
-      <w:r>
-        <w:t xml:space="preserve"> | Nov 2010 – Jun 2011</w:t>
-      </w:r>
-    </w:p>
-    <w:p>
-      <w:pPr>
-        <w:spacing w:after="20"/>
-      </w:pPr>
-      <w:r>
-        <w:rPr>
-          <w:sz w:val="15"/>
-        </w:rPr>
-        <w:t>Gobierno del Estado de México. Desarrollo de sistema para agilizar trámites de apertura de establecimientos. Consumo de Servicios Web. Aplicaciones con Silverlight 4.0, WCF y WPF. C#, LINQ, RIA Services, Entity Framework, SQL Server y Google Maps API.</w:t>
-      </w:r>
-    </w:p>
-    <w:p>
-      <w:pPr>
-        <w:spacing w:before="40" w:after="6"/>
-      </w:pPr>
-      <w:r>
-        <w:rPr>
-          <w:b/>
-          <w:sz w:val="17"/>
-        </w:rPr>
-        <w:t>Consultor Sr. .NET | Hosting Business</w:t>
-      </w:r>
-      <w:r>
-        <w:t xml:space="preserve"> | Oct 2009 – Oct 2010</w:t>
-      </w:r>
-    </w:p>
-    <w:p>
-      <w:pPr>
-        <w:spacing w:after="20"/>
-      </w:pPr>
-      <w:r>
-        <w:rPr>
-          <w:sz w:val="15"/>
-        </w:rPr>
-        <w:t>Cliente: TV Azteca. Desarrollo del Módulo de Producto Interno y soluciones para visualización de ventas mediante indicadores económicos. WPF, WCF, Silverlight 3/4, C#, LINQ, Oracle, MVVM/MVM, Visual Studio 2010 y Toolkit.</w:t>
-      </w:r>
-    </w:p>
-    <w:p>
-      <w:pPr>
-        <w:spacing w:before="40" w:after="6"/>
-      </w:pPr>
-      <w:r>
-        <w:rPr>
-          <w:b/>
-          <w:sz w:val="17"/>
-        </w:rPr>
-        <w:t>Desarrollador .NET | BRD</w:t>
-      </w:r>
-      <w:r>
-        <w:t xml:space="preserve"> | Oct 2008 – Oct 2009</w:t>
-      </w:r>
-    </w:p>
-    <w:p>
-      <w:pPr>
-        <w:spacing w:after="20"/>
-      </w:pPr>
-      <w:r>
-        <w:rPr>
-          <w:sz w:val="15"/>
-        </w:rPr>
-        <w:t>Cliente: Willis / Seguros. Mantenimiento y desarrollo de aplicaciones para Willis. .NET 2.0, C#, AJAX, Silverlight, WPF y Flex. SQL Server 2005 y Crystal Reports. Desarrollo de portales y aplicaciones orientadas a las necesidades del negocio.</w:t>
-      </w:r>
-    </w:p>
-    <w:p>
-      <w:pPr>
-        <w:spacing w:before="40" w:after="6"/>
-      </w:pPr>
-      <w:r>
-        <w:rPr>
-          <w:b/>
-          <w:sz w:val="17"/>
-        </w:rPr>
-        <w:t>Líder Técnico .NET | GONET</w:t>
-      </w:r>
-      <w:r>
-        <w:t xml:space="preserve"> | May 2008 – Nov 2008</w:t>
-      </w:r>
-    </w:p>
-    <w:p>
-      <w:pPr>
-        <w:spacing w:after="20"/>
-      </w:pPr>
-      <w:r>
-        <w:rPr>
-          <w:sz w:val="15"/>
-        </w:rPr>
-        <w:t>Solonis / Medical Solutions | Phoenix, Arizona, USA. Atención y desarrollo de requerimientos para diversos sistemas. Migración de sistemas de C++ a Java y mantenimiento de portales C# y WPF. C#, AJAX, XAML, Java, SQL Server y XML.</w:t>
-      </w:r>
-    </w:p>
-    <w:p>
-      <w:pPr>
-        <w:spacing w:before="40" w:after="6"/>
-      </w:pPr>
-      <w:r>
-        <w:rPr>
-          <w:b/>
-          <w:sz w:val="17"/>
-        </w:rPr>
-        <w:t>Líder .NET | Televisa</w:t>
-      </w:r>
-      <w:r>
-        <w:t xml:space="preserve"> | Feb 2007 – May 2008</w:t>
-      </w:r>
-    </w:p>
-    <w:p>
-      <w:pPr>
-        <w:spacing w:after="20"/>
-      </w:pPr>
-      <w:r>
-        <w:rPr>
-          <w:sz w:val="15"/>
-        </w:rPr>
-        <w:t>Call Center Multijuegos / Mercadotecnia. Diseño y programación de sistemas de información. WPF y Flash con C#, XAML y ActionScript 2.0. Diseño de páginas Web y Forms, campañas de Mailing, demos Windows Mobile 5.0, administración de servidores y bases de datos, indicadores y reportes de Call Center.</w:t>
-      </w:r>
-    </w:p>
-    <w:p>
-      <w:pPr>
-        <w:spacing w:before="40" w:after="6"/>
-      </w:pPr>
-      <w:r>
-        <w:rPr>
-          <w:b/>
-          <w:sz w:val="17"/>
-        </w:rPr>
-        <w:t>Sistemas | Language Teaching Services de México S.C.</w:t>
-      </w:r>
-      <w:r>
-        <w:t xml:space="preserve"> | Mar 2006 – Dic 2006</w:t>
-      </w:r>
-    </w:p>
-    <w:p>
-      <w:pPr>
-        <w:spacing w:after="20"/>
-      </w:pPr>
-      <w:r>
-        <w:rPr>
-          <w:sz w:val="15"/>
-        </w:rPr>
-        <w:t>Mini Intranet / Soporte. Desarrollo de una Mini Intranet para empresa del sector de idiomas. Diseño y desarrollo de la solución y de la base de datos. Encargado del área de Soporte.</w:t>
-      </w:r>
-    </w:p>
-    <w:p>
-      <w:pPr>
-        <w:spacing w:before="40" w:after="6"/>
-      </w:pPr>
-      <w:r>
-        <w:rPr>
-          <w:b/>
-          <w:sz w:val="17"/>
-        </w:rPr>
-        <w:t>Líder Técnico | Seguros ING – Comercial América</w:t>
-      </w:r>
-      <w:r>
-        <w:t xml:space="preserve"> | Abr 2003 – Feb 2006</w:t>
-      </w:r>
-    </w:p>
-    <w:p>
-      <w:pPr>
-        <w:spacing w:after="20"/>
-      </w:pPr>
-      <w:r>
-        <w:rPr>
-          <w:sz w:val="15"/>
-        </w:rPr>
-        <w:t>Control Operativo / AFORE / Venta Cruzada. Evaluación de requerimientos, mantenimiento y desarrollo de aplicaciones con Java, C# y Visual Basic. Monitoreo nacional de solicitudes de traspasos y afiliaciones AFORE y seguimiento de rechazos de DIGIPRO. Implementación de medidores y nuevos procesos que contribuyeron a disminuir rechazos del 12% al 8%. Catálogos, manuales, bases de datos y validación de traspasos AFORE y productos de American Express, seguros de vida y gastos médicos mayores.</w:t>
-      </w:r>
-    </w:p>
-    <w:p>
-      <w:pPr>
-        <w:spacing w:before="40" w:after="6"/>
-      </w:pPr>
-      <w:r>
-        <w:rPr>
-          <w:b/>
-          <w:sz w:val="17"/>
-        </w:rPr>
-        <w:t>Programador – Analista de Sistemas | México Lindo</w:t>
-      </w:r>
-      <w:r>
-        <w:t xml:space="preserve"> | Ene 2003 – Nov 2003</w:t>
-      </w:r>
-    </w:p>
-    <w:p>
-      <w:pPr>
-        <w:spacing w:after="20"/>
-      </w:pPr>
-      <w:r>
-        <w:rPr>
-          <w:sz w:val="15"/>
-        </w:rPr>
-        <w:t>Sistemas / base de datos / distribución. Desarrollo de sistema y base de datos para administración de líneas de productos de línea blanca y hogar en el extranjero. Control de las distintas líneas de distribución en el interior de la República.</w:t>
+        <w:t>Tecnologías: AWS · Azure · GCP · Serverless · Microservicios · React · Vue · Angular · Flutter · Ionic · Python · JavaScript · CI/CD · DevOps · IA · Machine Learning</w:t>
       </w:r>
     </w:p>
     <w:p>
@@ -639,24 +208,34 @@
       <w:r>
         <w:rPr>
           <w:b/>
-          <w:sz w:val="21"/>
+          <w:sz w:val="19"/>
         </w:rPr>
-        <w:t>EDUCACIÓN</w:t>
+        <w:t>Modatelas S.A.P.I. de C.V.</w:t>
+      </w:r>
+      <w:r>
+        <w:rPr>
+          <w:b/>
+          <w:sz w:val="19"/>
+        </w:rPr>
+        <w:t xml:space="preserve"> — Gerente de Desarrollo de Software | Ene 2017 – Abr 2020</w:t>
       </w:r>
     </w:p>
     <w:p>
+      <w:pPr>
+        <w:spacing w:after="20"/>
+        <w:ind w:left="216"/>
+      </w:pPr>
       <w:r>
-        <w:t>Maestría en Gestión de Tecnologías de la Información — Universidad del Valle de México | 2016–2019</w:t>
+        <w:t>Responsable del área de Desarrollo de Software, presupuesto, arquitectura, mantenimiento, nuevos sistemas y migración de aplicativos. Administración y control de personal de TI. Atención y seguimiento de requerimientos de inicio a fin. Diseño y desarrollo de interfaces con ERP, SAP y punto de venta, tableros y dashboards. Planes para nuevos sistemas, Transformación Digital e Innovación.</w:t>
       </w:r>
     </w:p>
     <w:p>
+      <w:pPr>
+        <w:spacing w:after="40"/>
+        <w:ind w:left="216"/>
+      </w:pPr>
       <w:r>
-        <w:t>Licenciatura en Informática Administrativa — Universidad Chapultepec | 2002–2005 | Titulado</w:t>
-      </w:r>
-    </w:p>
-    <w:p>
-      <w:r>
-        <w:t>Carrera Técnica en Informática Administrativa — Grupo Educativo IMEI | 2000–2002 | Técnico titulado</w:t>
+        <w:t>Tecnologías: C# / .NET · Java · SAP B1 / R3 · SQL Server · Android / iOS · Xamarin · Azure · Docker · Scrum · PMI · ITIL</w:t>
       </w:r>
     </w:p>
     <w:p>
@@ -666,14 +245,34 @@
       <w:r>
         <w:rPr>
           <w:b/>
-          <w:sz w:val="21"/>
+          <w:sz w:val="19"/>
         </w:rPr>
-        <w:t>CURSOS</w:t>
+        <w:t>Grupo Perti · Cliente: B&amp;P</w:t>
+      </w:r>
+      <w:r>
+        <w:rPr>
+          <w:b/>
+          <w:sz w:val="19"/>
+        </w:rPr>
+        <w:t xml:space="preserve"> — Consultor .NET y Android | Mar 2016 – Ene 2017</w:t>
       </w:r>
     </w:p>
     <w:p>
+      <w:pPr>
+        <w:spacing w:after="20"/>
+        <w:ind w:left="216"/>
+      </w:pPr>
       <w:r>
-        <w:t>AWS Solutions Architect | AWS Developer | Desarrollo de soluciones para Microsoft Azure | Fundamentos DevOps | ITIL Fundamentos | .NET Core 8, 9, 10</w:t>
+        <w:t>Sistema para captura de información en tiempo real, gestión y geolocalización de empresas, sucursales, formularios y proyectos dinámicos. Análisis de RFP, documentos de análisis, diseño y programación Android y Web, Front End y Back End, diagramas y arquitectura. Equipo de 5 personas.</w:t>
+      </w:r>
+    </w:p>
+    <w:p>
+      <w:pPr>
+        <w:spacing w:after="40"/>
+        <w:ind w:left="216"/>
+      </w:pPr>
+      <w:r>
+        <w:t>Tecnologías: .NET 4.6 · Android 7 · AngularJS · Web API 2 · SQL Server 2016 · Entity Framework 6 · Xamarin · Bootstrap · JSON</w:t>
       </w:r>
     </w:p>
     <w:p>
@@ -683,20 +282,776 @@
       <w:r>
         <w:rPr>
           <w:b/>
-          <w:sz w:val="21"/>
+          <w:sz w:val="19"/>
         </w:rPr>
-        <w:t>IDIOMAS</w:t>
+        <w:t>Deintec · Clientes: Conpaq, Televisa, Banco Bansi</w:t>
+      </w:r>
+      <w:r>
+        <w:rPr>
+          <w:b/>
+          <w:sz w:val="19"/>
+        </w:rPr>
+        <w:t xml:space="preserve"> — Consultor .NET | Ene 2015 – Mar 2016</w:t>
+      </w:r>
+    </w:p>
+    <w:p>
+      <w:pPr>
+        <w:spacing w:after="20"/>
+        <w:ind w:left="216"/>
+      </w:pPr>
+      <w:r>
+        <w:t>Desarrollo de aplicaciones Web y móviles. Control de equipos de trabajo y participación como Arquitecto de Aplicaciones. Manejo de capas, patrones de diseño y proyectos Web/Mobile. ASP.NET, MVC, Bootstrap, Xamarin, jQuery, JSON, JavaScript, C#, Java, SQL Server, SQLite, Windows Mobile, iOS, Android, WCF y Servicios Web.</w:t>
+      </w:r>
+    </w:p>
+    <w:p>
+      <w:pPr>
+        <w:spacing w:after="40"/>
+        <w:ind w:left="216"/>
+      </w:pPr>
+      <w:r>
+        <w:t>Tecnologías: ASP.NET MVC · C# · Xamarin · Java · Android / iOS · SQL Server · WCF · Web Services · Agile / Scrum</w:t>
+      </w:r>
+    </w:p>
+    <w:p>
+      <w:pPr>
+        <w:spacing w:before="80" w:after="20"/>
+      </w:pPr>
+      <w:r>
+        <w:rPr>
+          <w:b/>
+          <w:sz w:val="19"/>
+        </w:rPr>
+        <w:t>Hosting Business · Cliente: Banco Azteca</w:t>
+      </w:r>
+      <w:r>
+        <w:rPr>
+          <w:b/>
+          <w:sz w:val="19"/>
+        </w:rPr>
+        <w:t xml:space="preserve"> — Consultor Sr. .NET | Ene 2014 – Nov 2014</w:t>
+      </w:r>
+    </w:p>
+    <w:p>
+      <w:pPr>
+        <w:spacing w:after="20"/>
+        <w:ind w:left="216"/>
+      </w:pPr>
+      <w:r>
+        <w:t>Migración de pantallas ASP a ASP.NET. Programas de consola y escritorio para extracción de información. Migración de queries a funciones Oracle. Desarrollo de pantallas para aplicación SOAC. Desarrollo y consumo de Web Services y requerimientos de inicio a fin.</w:t>
+      </w:r>
+    </w:p>
+    <w:p>
+      <w:pPr>
+        <w:spacing w:after="40"/>
+        <w:ind w:left="216"/>
+      </w:pPr>
+      <w:r>
+        <w:t>Tecnologías: ASP.NET · C# · Oracle · AS400 · SQL · AJAX · jQuery · SOAP · Visual Studio</w:t>
+      </w:r>
+    </w:p>
+    <w:p>
+      <w:pPr>
+        <w:spacing w:before="80" w:after="20"/>
+      </w:pPr>
+      <w:r>
+        <w:rPr>
+          <w:b/>
+          <w:sz w:val="19"/>
+        </w:rPr>
+        <w:t>Softtek · Cliente: Banamex</w:t>
+      </w:r>
+      <w:r>
+        <w:rPr>
+          <w:b/>
+          <w:sz w:val="19"/>
+        </w:rPr>
+        <w:t xml:space="preserve"> — Integrador Tecnológico | May 2013 – Nov 2013</w:t>
+      </w:r>
+    </w:p>
+    <w:p>
+      <w:pPr>
+        <w:spacing w:after="20"/>
+        <w:ind w:left="216"/>
+      </w:pPr>
+      <w:r>
+        <w:t>Alineación y migración de software de Windows XP a Windows 7. Negociación, comunicación con responsables de aplicaciones, planeación, ejecución de objetivos, mantenimiento de aplicaciones y resolución de problemas. Tecnologías .NET, SQL Server, Oracle, Java, VB.NET, macros y herramientas de desarrollo.</w:t>
+      </w:r>
+    </w:p>
+    <w:p>
+      <w:pPr>
+        <w:spacing w:after="40"/>
+        <w:ind w:left="216"/>
+      </w:pPr>
+      <w:r>
+        <w:t>Tecnologías: C# · VB.NET · .NET · Java · SQL Server · Oracle · Access · VB 6.0 · LINQ · Visual Studio</w:t>
+      </w:r>
+    </w:p>
+    <w:p>
+      <w:pPr>
+        <w:spacing w:before="80" w:after="20"/>
+      </w:pPr>
+      <w:r>
+        <w:rPr>
+          <w:b/>
+          <w:sz w:val="19"/>
+        </w:rPr>
+        <w:t>CE Consulting · Cliente: Televisa</w:t>
+      </w:r>
+      <w:r>
+        <w:rPr>
+          <w:b/>
+          <w:sz w:val="19"/>
+        </w:rPr>
+        <w:t xml:space="preserve"> — Líder Técnico .NET | Dic 2012 – Mar 2013</w:t>
+      </w:r>
+    </w:p>
+    <w:p>
+      <w:pPr>
+        <w:spacing w:after="20"/>
+        <w:ind w:left="216"/>
+      </w:pPr>
+      <w:r>
+        <w:t>Atención de requerimientos y manejo de equipo de trabajo, con 2 desarrolladores a cargo. Desarrollo de aplicaciones .NET y migración de aplicaciones de Java a .NET. Aplicaciones demo para Android e iOS y desarrollo de ETLs. Oracle 11, SQL Server, Java, .NET, Visual Studio y JDeveloper.</w:t>
+      </w:r>
+    </w:p>
+    <w:p>
+      <w:pPr>
+        <w:spacing w:after="40"/>
+        <w:ind w:left="216"/>
+      </w:pPr>
+      <w:r>
+        <w:t>Tecnologías: Liderazgo Técnico · .NET · Java · Android · iOS · ETL · Oracle · SQL Server · Visual Studio</w:t>
+      </w:r>
+    </w:p>
+    <w:p>
+      <w:pPr>
+        <w:spacing w:before="80" w:after="20"/>
+      </w:pPr>
+      <w:r>
+        <w:rPr>
+          <w:b/>
+          <w:sz w:val="19"/>
+        </w:rPr>
+        <w:t>TSD</w:t>
+      </w:r>
+      <w:r>
+        <w:rPr>
+          <w:b/>
+          <w:sz w:val="19"/>
+        </w:rPr>
+        <w:t xml:space="preserve"> — Gerente de Desarrollo de Software | May 2012 – Dic 2012</w:t>
+      </w:r>
+    </w:p>
+    <w:p>
+      <w:pPr>
+        <w:spacing w:after="20"/>
+        <w:ind w:left="216"/>
+      </w:pPr>
+      <w:r>
+        <w:t>Administración y control del área de Desarrollo de Software. Atención de requerimientos y sistemas propios. Implementación de mejoras y control de cambios/versiones mediante HelpDesk BMC. Desarrollos .NET y Java. Negociación con clientes internos y externos. Planeación y control de sistemas.</w:t>
+      </w:r>
+    </w:p>
+    <w:p>
+      <w:pPr>
+        <w:spacing w:after="40"/>
+        <w:ind w:left="216"/>
+      </w:pPr>
+      <w:r>
+        <w:t>Tecnologías: Gerencia de Desarrollo · Administración · .NET · Java · BMC HelpDesk · Planeación · Gestión de requerimientos</w:t>
+      </w:r>
+    </w:p>
+    <w:p>
+      <w:pPr>
+        <w:spacing w:before="80" w:after="20"/>
+      </w:pPr>
+      <w:r>
+        <w:rPr>
+          <w:b/>
+          <w:sz w:val="19"/>
+        </w:rPr>
+        <w:t>ARRASA</w:t>
+      </w:r>
+      <w:r>
+        <w:rPr>
+          <w:b/>
+          <w:sz w:val="19"/>
+        </w:rPr>
+        <w:t xml:space="preserve"> — Arquitecto .NET | Ene 2012 – May 2012</w:t>
+      </w:r>
+    </w:p>
+    <w:p>
+      <w:pPr>
+        <w:spacing w:after="20"/>
+        <w:ind w:left="216"/>
+      </w:pPr>
+      <w:r>
+        <w:t>Diseño de arquitectura de aplicación de seguridad y controles de acceso. Desarrollo de Middleware, arquitectura y diseño de servicios, Servicios Web y aplicaciones con biométricos de iris y dactilares. Implementación de patrones de diseño .NET.</w:t>
+      </w:r>
+    </w:p>
+    <w:p>
+      <w:pPr>
+        <w:spacing w:after="40"/>
+        <w:ind w:left="216"/>
+      </w:pPr>
+      <w:r>
+        <w:t>Tecnologías: Arquitectura · .NET · C# · Oracle · Wiegand · ASP.NET · Silverlight 4 · Servicios Web · Biometría</w:t>
+      </w:r>
+    </w:p>
+    <w:p>
+      <w:pPr>
+        <w:spacing w:before="80" w:after="20"/>
+      </w:pPr>
+      <w:r>
+        <w:rPr>
+          <w:b/>
+          <w:sz w:val="19"/>
+        </w:rPr>
+        <w:t>ATENTO</w:t>
+      </w:r>
+      <w:r>
+        <w:rPr>
+          <w:b/>
+          <w:sz w:val="19"/>
+        </w:rPr>
+        <w:t xml:space="preserve"> — Líder de Proyecto .NET | Oct 2011 – Ene 2012</w:t>
+      </w:r>
+    </w:p>
+    <w:p>
+      <w:pPr>
+        <w:spacing w:after="20"/>
+        <w:ind w:left="216"/>
+      </w:pPr>
+      <w:r>
+        <w:t>Desarrollo de sistemas aplicando Scrum. Desarrollo Silverlight y participación en sistema AutoExpressManager. Proyecto temporal para concluir primera fase del sistema y atención de requerimientos.</w:t>
+      </w:r>
+    </w:p>
+    <w:p>
+      <w:pPr>
+        <w:spacing w:after="40"/>
+        <w:ind w:left="216"/>
+      </w:pPr>
+      <w:r>
+        <w:t>Tecnologías: Liderazgo de Proyecto · Silverlight 4 · WCF · WPF · C# · VB.NET · LINQ · JavaScript · SQL Server 2008 · SVN · RUP</w:t>
+      </w:r>
+    </w:p>
+    <w:p>
+      <w:pPr>
+        <w:spacing w:before="80" w:after="20"/>
+      </w:pPr>
+      <w:r>
+        <w:rPr>
+          <w:b/>
+          <w:sz w:val="19"/>
+        </w:rPr>
+        <w:t>Hosting Business · Cliente: Banco Azteca</w:t>
+      </w:r>
+      <w:r>
+        <w:rPr>
+          <w:b/>
+          <w:sz w:val="19"/>
+        </w:rPr>
+        <w:t xml:space="preserve"> — Consultor Sr. .NET | Jun 2011 – Oct 2011</w:t>
+      </w:r>
+    </w:p>
+    <w:p>
+      <w:pPr>
+        <w:spacing w:after="20"/>
+        <w:ind w:left="216"/>
+      </w:pPr>
+      <w:r>
+        <w:t>Desarrollo en el Portal Banco Azteca. Servicios REST y XML. Desarrollo con MVC y Silverlight, flujos de trabajo y soluciones para Windows Mobile y Android.</w:t>
+      </w:r>
+    </w:p>
+    <w:p>
+      <w:pPr>
+        <w:spacing w:after="40"/>
+        <w:ind w:left="216"/>
+      </w:pPr>
+      <w:r>
+        <w:t>Tecnologías: Banco Azteca · REST · XML · MVC · Silverlight 4 · WCF · WPF · C# · Java · MVVM · Windows Mobile · Android</w:t>
+      </w:r>
+    </w:p>
+    <w:p>
+      <w:pPr>
+        <w:spacing w:before="80" w:after="20"/>
+      </w:pPr>
+      <w:r>
+        <w:rPr>
+          <w:b/>
+          <w:sz w:val="19"/>
+        </w:rPr>
+        <w:t>MAPDATA · Gobierno del Estado de México</w:t>
+      </w:r>
+      <w:r>
+        <w:rPr>
+          <w:b/>
+          <w:sz w:val="19"/>
+        </w:rPr>
+        <w:t xml:space="preserve"> — Consultor Sr. .NET | Nov 2010 – Jun 2011</w:t>
+      </w:r>
+    </w:p>
+    <w:p>
+      <w:pPr>
+        <w:spacing w:after="20"/>
+        <w:ind w:left="216"/>
+      </w:pPr>
+      <w:r>
+        <w:t>Desarrollo de sistema para agilizar trámites de apertura de establecimientos. Consumo de Servicios Web y desarrollo con Silverlight 4.0, WCF y WPF. C#, LINQ, RIA Services, Entity Framework, SQL Server y Google Maps API.</w:t>
+      </w:r>
+    </w:p>
+    <w:p>
+      <w:pPr>
+        <w:spacing w:after="40"/>
+        <w:ind w:left="216"/>
+      </w:pPr>
+      <w:r>
+        <w:t>Tecnologías: Gobierno · Silverlight 4 · WCF · WPF · C# · LINQ · RIA Services · Entity Framework · SQL Server · Google Maps API</w:t>
+      </w:r>
+    </w:p>
+    <w:p>
+      <w:pPr>
+        <w:spacing w:before="80" w:after="20"/>
+      </w:pPr>
+      <w:r>
+        <w:rPr>
+          <w:b/>
+          <w:sz w:val="19"/>
+        </w:rPr>
+        <w:t>Hosting Business · Cliente: TV Azteca</w:t>
+      </w:r>
+      <w:r>
+        <w:rPr>
+          <w:b/>
+          <w:sz w:val="19"/>
+        </w:rPr>
+        <w:t xml:space="preserve"> — Consultor Sr. .NET | Oct 2009 – Oct 2010</w:t>
+      </w:r>
+    </w:p>
+    <w:p>
+      <w:pPr>
+        <w:spacing w:after="20"/>
+        <w:ind w:left="216"/>
+      </w:pPr>
+      <w:r>
+        <w:t>Desarrollo del Módulo de Producto Interno y visualización de ventas mediante indicadores económicos. Desarrollo con Toolkit, WPF, WCF y Silverlight. C#, LINQ, Oracle y patrones MVVM/MVM.</w:t>
+      </w:r>
+    </w:p>
+    <w:p>
+      <w:pPr>
+        <w:spacing w:after="40"/>
+        <w:ind w:left="216"/>
+      </w:pPr>
+      <w:r>
+        <w:t>Tecnologías: TV Azteca · WPF · WCF · Silverlight 4 · C# · LINQ · Oracle · MVVM · MVM · Visual Studio 2010</w:t>
+      </w:r>
+    </w:p>
+    <w:p>
+      <w:pPr>
+        <w:spacing w:before="80" w:after="20"/>
+      </w:pPr>
+      <w:r>
+        <w:rPr>
+          <w:b/>
+          <w:sz w:val="19"/>
+        </w:rPr>
+        <w:t>BRD · Cliente: Willis / Seguros</w:t>
+      </w:r>
+      <w:r>
+        <w:rPr>
+          <w:b/>
+          <w:sz w:val="19"/>
+        </w:rPr>
+        <w:t xml:space="preserve"> — Desarrollador .NET | Oct 2008 – Oct 2009</w:t>
+      </w:r>
+    </w:p>
+    <w:p>
+      <w:pPr>
+        <w:spacing w:after="20"/>
+        <w:ind w:left="216"/>
+      </w:pPr>
+      <w:r>
+        <w:t>Mantenimiento y desarrollo de aplicaciones para Willis, empresa del sector seguros. .NET 2.0, C#, AJAX, Silverlight, WPF y Flex. SQL Server 2005 y Crystal Reports.</w:t>
+      </w:r>
+    </w:p>
+    <w:p>
+      <w:pPr>
+        <w:spacing w:after="40"/>
+        <w:ind w:left="216"/>
+      </w:pPr>
+      <w:r>
+        <w:t>Tecnologías: Seguros · .NET 2.0 · C# · AJAX · Silverlight · WPF · Flex · SQL Server · Crystal Reports</w:t>
+      </w:r>
+    </w:p>
+    <w:p>
+      <w:pPr>
+        <w:spacing w:before="80" w:after="20"/>
+      </w:pPr>
+      <w:r>
+        <w:rPr>
+          <w:b/>
+          <w:sz w:val="19"/>
+        </w:rPr>
+        <w:t>GONET · Phoenix, Arizona, USA</w:t>
+      </w:r>
+      <w:r>
+        <w:rPr>
+          <w:b/>
+          <w:sz w:val="19"/>
+        </w:rPr>
+        <w:t xml:space="preserve"> — Líder Técnico .NET | May 2008 – Nov 2008</w:t>
+      </w:r>
+    </w:p>
+    <w:p>
+      <w:pPr>
+        <w:spacing w:after="20"/>
+        <w:ind w:left="216"/>
+      </w:pPr>
+      <w:r>
+        <w:t>Requerimientos para diversos sistemas, incluyendo Solonis y Medical Solutions. Migración de sistema de C++ a Java y mantenimiento de portales C# y WPF.</w:t>
+      </w:r>
+    </w:p>
+    <w:p>
+      <w:pPr>
+        <w:spacing w:after="40"/>
+        <w:ind w:left="216"/>
+      </w:pPr>
+      <w:r>
+        <w:t>Tecnologías: Phoenix, Arizona · C# · C++ · Java · WPF · AJAX · XAML · SQL Server · XML</w:t>
+      </w:r>
+    </w:p>
+    <w:p>
+      <w:pPr>
+        <w:spacing w:before="80" w:after="20"/>
+      </w:pPr>
+      <w:r>
+        <w:rPr>
+          <w:b/>
+          <w:sz w:val="19"/>
+        </w:rPr>
+        <w:t>Televisa</w:t>
+      </w:r>
+      <w:r>
+        <w:rPr>
+          <w:b/>
+          <w:sz w:val="19"/>
+        </w:rPr>
+        <w:t xml:space="preserve"> — Líder .NET | Feb 2007 – May 2008</w:t>
+      </w:r>
+    </w:p>
+    <w:p>
+      <w:pPr>
+        <w:spacing w:after="20"/>
+        <w:ind w:left="216"/>
+      </w:pPr>
+      <w:r>
+        <w:t>Diseño y programación de sistemas de información para Call Center Multijuegos y Mercadotecnia. WPF y Flash con C#, XAML y ActionScript 2.0. Diseño Web y Forms, campañas de Mailing, demos Windows Mobile, administración de servidores y bases de datos, indicadores y reportes.</w:t>
+      </w:r>
+    </w:p>
+    <w:p>
+      <w:pPr>
+        <w:spacing w:after="40"/>
+        <w:ind w:left="216"/>
+      </w:pPr>
+      <w:r>
+        <w:t>Tecnologías: Call Center · WPF · Flash · C# · XAML · ActionScript · Windows Mobile · Bases de Datos · Reportes</w:t>
+      </w:r>
+    </w:p>
+    <w:p>
+      <w:pPr>
+        <w:spacing w:before="80" w:after="20"/>
+      </w:pPr>
+      <w:r>
+        <w:rPr>
+          <w:b/>
+          <w:sz w:val="19"/>
+        </w:rPr>
+        <w:t>Language Teaching Services de México S.C.</w:t>
+      </w:r>
+      <w:r>
+        <w:rPr>
+          <w:b/>
+          <w:sz w:val="19"/>
+        </w:rPr>
+        <w:t xml:space="preserve"> — Sistemas | Mar 2006 – Dic 2006</w:t>
+      </w:r>
+    </w:p>
+    <w:p>
+      <w:pPr>
+        <w:spacing w:after="20"/>
+        <w:ind w:left="216"/>
+      </w:pPr>
+      <w:r>
+        <w:t>Desarrollo de una Mini Intranet para empresa de idiomas. Diseño y desarrollo de la solución y base de datos. Encargado del área de Soporte.</w:t>
+      </w:r>
+    </w:p>
+    <w:p>
+      <w:pPr>
+        <w:spacing w:after="40"/>
+        <w:ind w:left="216"/>
+      </w:pPr>
+      <w:r>
+        <w:t>Tecnologías: Mini Intranet · Bases de Datos · Soporte · Desarrollo Web</w:t>
+      </w:r>
+    </w:p>
+    <w:p>
+      <w:pPr>
+        <w:spacing w:before="80" w:after="20"/>
+      </w:pPr>
+      <w:r>
+        <w:rPr>
+          <w:b/>
+          <w:sz w:val="19"/>
+        </w:rPr>
+        <w:t>Seguros ING – Comercial América</w:t>
+      </w:r>
+      <w:r>
+        <w:rPr>
+          <w:b/>
+          <w:sz w:val="19"/>
+        </w:rPr>
+        <w:t xml:space="preserve"> — Líder Técnico | Abr 2003 – Feb 2006</w:t>
+      </w:r>
+    </w:p>
+    <w:p>
+      <w:pPr>
+        <w:spacing w:after="20"/>
+        <w:ind w:left="216"/>
+      </w:pPr>
+      <w:r>
+        <w:t>Evaluación de requerimientos, mantenimiento y desarrollo de aplicaciones con Java, C# y Visual Basic. Monitoreo nacional de solicitudes de traspasos y afiliaciones AFORE. Implementación de medidores y nuevos procesos que contribuyeron a disminuir rechazos del 12% al 8%. Catálogos, manuales, bases de datos y validación de productos financieros y seguros.</w:t>
+      </w:r>
+    </w:p>
+    <w:p>
+      <w:pPr>
+        <w:spacing w:after="40"/>
+        <w:ind w:left="216"/>
+      </w:pPr>
+      <w:r>
+        <w:t>Tecnologías: Seguros / AFORE · Java · C# · Visual Basic · Bases de Datos · Control Operativo · Indicadores · Venta Cruzada</w:t>
+      </w:r>
+    </w:p>
+    <w:p>
+      <w:pPr>
+        <w:spacing w:before="80" w:after="20"/>
+      </w:pPr>
+      <w:r>
+        <w:rPr>
+          <w:b/>
+          <w:sz w:val="19"/>
+        </w:rPr>
+        <w:t>México Lindo</w:t>
+      </w:r>
+      <w:r>
+        <w:rPr>
+          <w:b/>
+          <w:sz w:val="19"/>
+        </w:rPr>
+        <w:t xml:space="preserve"> — Programador – Analista de Sistemas | Ene 2003 – Nov 2003</w:t>
+      </w:r>
+    </w:p>
+    <w:p>
+      <w:pPr>
+        <w:spacing w:after="20"/>
+        <w:ind w:left="216"/>
+      </w:pPr>
+      <w:r>
+        <w:t>Desarrollo de sistema y base de datos para la administración de líneas de productos de línea blanca y hogar en el extranjero. Control de líneas de distribución en el interior de la República.</w:t>
+      </w:r>
+    </w:p>
+    <w:p>
+      <w:pPr>
+        <w:spacing w:after="40"/>
+        <w:ind w:left="216"/>
+      </w:pPr>
+      <w:r>
+        <w:t>Tecnologías: Sistemas · Bases de Datos · Análisis de Sistemas · Desarrollo · Distribución</w:t>
+      </w:r>
+    </w:p>
+    <w:p>
+      <w:pPr>
+        <w:spacing w:before="140" w:after="60"/>
+      </w:pPr>
+      <w:r>
+        <w:rPr>
+          <w:b/>
+          <w:sz w:val="22"/>
+        </w:rPr>
+        <w:t>PROYECTOS DESTACADOS</w:t>
+      </w:r>
+    </w:p>
+    <w:p>
+      <w:pPr>
+        <w:spacing w:after="20"/>
+      </w:pPr>
+      <w:r>
+        <w:rPr>
+          <w:b/>
+        </w:rPr>
+        <w:t>Plataforma OTT &amp; Streaming (VIVARO Digital)</w:t>
       </w:r>
     </w:p>
     <w:p>
       <w:r>
-        <w:t>Inglés — Intermedio Alto</w:t>
+        <w:t>Arquitectura cloud-native sobre AWS para plataforma de video bajo demanda. Microservicios serverless, integración con Bitmovin Player, analítica con Google Analytics y Bitmovin, sistema de pagos con Stripe y PayPal, y capacidades de Machine Learning.</w:t>
+      </w:r>
+    </w:p>
+    <w:p>
+      <w:pPr>
+        <w:spacing w:after="20"/>
+      </w:pPr>
+      <w:r>
+        <w:rPr>
+          <w:b/>
+        </w:rPr>
+        <w:t>Automatización Cobro Hipotecario</w:t>
+      </w:r>
+    </w:p>
+    <w:p>
+      <w:r>
+        <w:t>Optimización del proceso de cobro automático y crédito hipotecario en entidad financiera. Integración de mainframes con servicios REST modernos y pipelines CI/CD.</w:t>
+      </w:r>
+    </w:p>
+    <w:p>
+      <w:pPr>
+        <w:spacing w:after="20"/>
+      </w:pPr>
+      <w:r>
+        <w:rPr>
+          <w:b/>
+        </w:rPr>
+        <w:t>ERP &amp; Punto de Venta Retail</w:t>
+      </w:r>
+    </w:p>
+    <w:p>
+      <w:r>
+        <w:t>Integración ERP SAP B1/R3 con punto de venta Wincor Nixdorf. Facturación electrónica CFDI, campañas SMS y dashboards para cadena retail.</w:t>
+      </w:r>
+    </w:p>
+    <w:p>
+      <w:pPr>
+        <w:spacing w:after="20"/>
+      </w:pPr>
+      <w:r>
+        <w:rPr>
+          <w:b/>
+        </w:rPr>
+        <w:t>Sistema de Geolocalización Empresarial</w:t>
+      </w:r>
+    </w:p>
+    <w:p>
+      <w:r>
+        <w:t>Gestión de empresas, sucursales y formularios dinámicos con geolocalización en tiempo real. App Android + portal web con Angular.js y .NET Web API 2.</w:t>
+      </w:r>
+    </w:p>
+    <w:p>
+      <w:pPr>
+        <w:spacing w:after="20"/>
+      </w:pPr>
+      <w:r>
+        <w:rPr>
+          <w:b/>
+        </w:rPr>
+        <w:t>Sistema Biométrico de Accesos</w:t>
+      </w:r>
+    </w:p>
+    <w:p>
+      <w:r>
+        <w:t>Arquitectura y desarrollo de sistema de seguridad con biométricos de iris y dactilares usando protocolo Wiegand. Middleware propio, servicios web y Silverlight 4.</w:t>
+      </w:r>
+    </w:p>
+    <w:p>
+      <w:pPr>
+        <w:spacing w:after="20"/>
+      </w:pPr>
+      <w:r>
+        <w:rPr>
+          <w:b/>
+        </w:rPr>
+        <w:t>Dashboard Indicadores TV Azteca</w:t>
+      </w:r>
+    </w:p>
+    <w:p>
+      <w:r>
+        <w:t>Visualización de ventas e indicadores económicos internos usando WPF / WCF con Silverlight. Reportes interactivos y ETLs para área de inteligencia de negocios.</w:t>
+      </w:r>
+    </w:p>
+    <w:p>
+      <w:pPr>
+        <w:spacing w:before="140" w:after="60"/>
+      </w:pPr>
+      <w:r>
+        <w:rPr>
+          <w:b/>
+          <w:sz w:val="22"/>
+        </w:rPr>
+        <w:t>TECNOLOGÍAS Y HERRAMIENTAS</w:t>
+      </w:r>
+    </w:p>
+    <w:p>
+      <w:r>
+        <w:t>Cloud &amp; DevOps: AWS · Azure · Google Cloud · Serverless · Docker · Kubernetes · CI/CD · GitHub Actions · Pipelines · IaC</w:t>
+      </w:r>
+    </w:p>
+    <w:p>
+      <w:r>
+        <w:t>Frontend &amp; Mobile: React · Angular · Vue.js · Flutter · Ionic · JavaScript · TypeScript · HTML5 / CSS3 · Bootstrap · Android · iOS / Xamarin</w:t>
+      </w:r>
+    </w:p>
+    <w:p>
+      <w:r>
+        <w:t>Backend &amp; Arquitectura: C# / .NET · Java / EE · Python · REST APIs · Microservicios · WCF / SOAP · Node.js · Mainframes · Patrones de diseño</w:t>
+      </w:r>
+    </w:p>
+    <w:p>
+      <w:r>
+        <w:t>Bases de Datos: SQL Server · Oracle · MongoDB · DynamoDB · Cosmos DB · Firebase · MySQL · SQLite · Azure SQL</w:t>
+      </w:r>
+    </w:p>
+    <w:p>
+      <w:r>
+        <w:t>IA &amp; Analytics: Machine Learning · IA / LLMs · Google Analytics · Bitmovin Analytics · Python / Pandas · Estadísticas · Dashboards · ETL</w:t>
+      </w:r>
+    </w:p>
+    <w:p>
+      <w:r>
+        <w:t>Metodologías &amp; Liderazgo: Scrum · Kanban · DevOps · ITIL Fundamentos · PMI · RUP / CMMI · Tech Lead · Arquitectura · Jira · Confluence · Transformación Digital</w:t>
+      </w:r>
+    </w:p>
+    <w:p>
+      <w:pPr>
+        <w:spacing w:before="140" w:after="60"/>
+      </w:pPr>
+      <w:r>
+        <w:rPr>
+          <w:b/>
+          <w:sz w:val="22"/>
+        </w:rPr>
+        <w:t>EDUCACIÓN Y CURSOS</w:t>
+      </w:r>
+    </w:p>
+    <w:p>
+      <w:r>
+        <w:t>Maestría en Gestión de Tecnologías de la Información Universidad del Valle de México 2016 – 2019</w:t>
+      </w:r>
+    </w:p>
+    <w:p>
+      <w:r>
+        <w:t>Licenciatura en Informática Administrativa Universidad Chapultepec 2002 – 2005 · Titulado</w:t>
+      </w:r>
+    </w:p>
+    <w:p>
+      <w:r>
+        <w:t>Técnico en Informática Administrativa Grupo Educativo IMEI 2000 – 2002 · Técnico titulado</w:t>
+      </w:r>
+    </w:p>
+    <w:p>
+      <w:r>
+        <w:t>Cursos Formación complementaria AWS Solutions Architect AWS Developer Microsoft Azure Fundamentos DevOps ITIL Fundamentos .NET Core 8, 9, 10</w:t>
       </w:r>
     </w:p>
     <w:sectPr>
-      <w:footerReference w:type="default" r:id="rId8"/>
       <w:pgSz w:w="12240" w:h="15840"/>
-      <w:pgMar w:top="648" w:right="792" w:bottom="648" w:left="792" w:header="720" w:footer="720" w:gutter="0"/>
+      <w:pgMar w:top="792" w:right="936" w:bottom="792" w:left="936" w:header="720" w:footer="720" w:gutter="0"/>
       <w:cols w:space="720"/>
       <w:docGrid w:linePitch="360"/>
     </w:sectPr>
@@ -704,106 +1059,8 @@
 </w:document>
 </file>
 
-<file path=word/endnotes.xml><?xml version="1.0" encoding="utf-8"?>
-<w:endnotes xmlns:ve="http://schemas.openxmlformats.org/markup-compatibility/2006" xmlns:o="urn:schemas-microsoft-com:office:office" xmlns:r="http://schemas.openxmlformats.org/officeDocument/2006/relationships" xmlns:m="http://schemas.openxmlformats.org/officeDocument/2006/math" xmlns:v="urn:schemas-microsoft-com:vml" xmlns:wp="http://schemas.openxmlformats.org/drawingml/2006/wordprocessingDrawing" xmlns:w10="urn:schemas-microsoft-com:office:word" xmlns:w="http://schemas.openxmlformats.org/wordprocessingml/2006/main" xmlns:wne="http://schemas.microsoft.com/office/word/2006/wordml">
-  <w:endnote w:type="separator" w:id="-1">
-    <w:p>
-      <w:pPr>
-        <w:spacing w:after="0" w:line="240" w:lineRule="auto"/>
-      </w:pPr>
-      <w:r>
-        <w:separator/>
-      </w:r>
-    </w:p>
-  </w:endnote>
-  <w:endnote w:type="continuationSeparator" w:id="0">
-    <w:p>
-      <w:pPr>
-        <w:spacing w:after="0" w:line="240" w:lineRule="auto"/>
-      </w:pPr>
-      <w:r>
-        <w:continuationSeparator/>
-      </w:r>
-    </w:p>
-  </w:endnote>
-</w:endnotes>
-</file>
-
-<file path=word/footer1.xml><?xml version="1.0" encoding="utf-8"?>
-<w:ftr xmlns:ve="http://schemas.openxmlformats.org/markup-compatibility/2006" xmlns:o="urn:schemas-microsoft-com:office:office" xmlns:r="http://schemas.openxmlformats.org/officeDocument/2006/relationships" xmlns:m="http://schemas.openxmlformats.org/officeDocument/2006/math" xmlns:v="urn:schemas-microsoft-com:vml" xmlns:wp="http://schemas.openxmlformats.org/drawingml/2006/wordprocessingDrawing" xmlns:w10="urn:schemas-microsoft-com:office:word" xmlns:w="http://schemas.openxmlformats.org/wordprocessingml/2006/main" xmlns:wne="http://schemas.microsoft.com/office/word/2006/wordml">
-  <w:p>
-    <w:pPr>
-      <w:pStyle w:val="Piedepgina"/>
-      <w:jc w:val="center"/>
-    </w:pPr>
-    <w:r>
-      <w:rPr>
-        <w:sz w:val="14"/>
-      </w:rPr>
-      <w:t xml:space="preserve">Marco A. González Obregón | CV OCC | Página </w:t>
-    </w:r>
-    <w:r>
-      <w:rPr>
-        <w:sz w:val="14"/>
-      </w:rPr>
-      <w:fldChar w:fldCharType="begin"/>
-    </w:r>
-    <w:r>
-      <w:rPr>
-        <w:sz w:val="14"/>
-      </w:rPr>
-      <w:instrText>PAGE</w:instrText>
-    </w:r>
-    <w:r>
-      <w:rPr>
-        <w:sz w:val="14"/>
-      </w:rPr>
-      <w:fldChar w:fldCharType="separate"/>
-    </w:r>
-    <w:r>
-      <w:rPr>
-        <w:noProof/>
-        <w:sz w:val="14"/>
-      </w:rPr>
-      <w:t>1</w:t>
-    </w:r>
-    <w:r>
-      <w:rPr>
-        <w:sz w:val="14"/>
-      </w:rPr>
-      <w:fldChar w:fldCharType="end"/>
-    </w:r>
-  </w:p>
-</w:ftr>
-</file>
-
-<file path=word/footnotes.xml><?xml version="1.0" encoding="utf-8"?>
-<w:footnotes xmlns:ve="http://schemas.openxmlformats.org/markup-compatibility/2006" xmlns:o="urn:schemas-microsoft-com:office:office" xmlns:r="http://schemas.openxmlformats.org/officeDocument/2006/relationships" xmlns:m="http://schemas.openxmlformats.org/officeDocument/2006/math" xmlns:v="urn:schemas-microsoft-com:vml" xmlns:wp="http://schemas.openxmlformats.org/drawingml/2006/wordprocessingDrawing" xmlns:w10="urn:schemas-microsoft-com:office:word" xmlns:w="http://schemas.openxmlformats.org/wordprocessingml/2006/main" xmlns:wne="http://schemas.microsoft.com/office/word/2006/wordml">
-  <w:footnote w:type="separator" w:id="-1">
-    <w:p>
-      <w:pPr>
-        <w:spacing w:after="0" w:line="240" w:lineRule="auto"/>
-      </w:pPr>
-      <w:r>
-        <w:separator/>
-      </w:r>
-    </w:p>
-  </w:footnote>
-  <w:footnote w:type="continuationSeparator" w:id="0">
-    <w:p>
-      <w:pPr>
-        <w:spacing w:after="0" w:line="240" w:lineRule="auto"/>
-      </w:pPr>
-      <w:r>
-        <w:continuationSeparator/>
-      </w:r>
-    </w:p>
-  </w:footnote>
-</w:footnotes>
-</file>
-
 <file path=word/numbering.xml><?xml version="1.0" encoding="utf-8"?>
-<w:numbering xmlns:ve="http://schemas.openxmlformats.org/markup-compatibility/2006" xmlns:o="urn:schemas-microsoft-com:office:office" xmlns:r="http://schemas.openxmlformats.org/officeDocument/2006/relationships" xmlns:m="http://schemas.openxmlformats.org/officeDocument/2006/math" xmlns:v="urn:schemas-microsoft-com:vml" xmlns:wp="http://schemas.openxmlformats.org/drawingml/2006/wordprocessingDrawing" xmlns:w10="urn:schemas-microsoft-com:office:word" xmlns:w="http://schemas.openxmlformats.org/wordprocessingml/2006/main" xmlns:wne="http://schemas.microsoft.com/office/word/2006/wordml">
+<w:numbering xmlns:wpc="http://schemas.microsoft.com/office/word/2010/wordprocessingCanvas" xmlns:mo="http://schemas.microsoft.com/office/mac/office/2008/main" xmlns:mc="http://schemas.openxmlformats.org/markup-compatibility/2006" xmlns:mv="urn:schemas-microsoft-com:mac:vml" xmlns:o="urn:schemas-microsoft-com:office:office" xmlns:r="http://schemas.openxmlformats.org/officeDocument/2006/relationships" xmlns:m="http://schemas.openxmlformats.org/officeDocument/2006/math" xmlns:v="urn:schemas-microsoft-com:vml" xmlns:wp14="http://schemas.microsoft.com/office/word/2010/wordprocessingDrawing" xmlns:wp="http://schemas.openxmlformats.org/drawingml/2006/wordprocessingDrawing" xmlns:w10="urn:schemas-microsoft-com:office:word" xmlns:w="http://schemas.openxmlformats.org/wordprocessingml/2006/main" xmlns:w14="http://schemas.microsoft.com/office/word/2010/wordml" xmlns:wpg="http://schemas.microsoft.com/office/word/2010/wordprocessingGroup" xmlns:wpi="http://schemas.microsoft.com/office/word/2010/wordprocessingInk" xmlns:wne="http://schemas.microsoft.com/office/word/2006/wordml" xmlns:wps="http://schemas.microsoft.com/office/word/2010/wordprocessingShape" mc:Ignorable="w14 wp14">
   <w:abstractNum w:abstractNumId="0">
     <w:nsid w:val="FFFFFF7C"/>
     <w:multiLevelType w:val="singleLevel"/>
@@ -845,7 +1102,7 @@
     <w:lvl w:ilvl="0">
       <w:start w:val="1"/>
       <w:numFmt w:val="decimal"/>
-      <w:pStyle w:val="Listaconnmeros3"/>
+      <w:pStyle w:val="ListNumber3"/>
       <w:lvlText w:val="%1."/>
       <w:lvlJc w:val="left"/>
       <w:pPr>
@@ -863,7 +1120,7 @@
     <w:lvl w:ilvl="0">
       <w:start w:val="1"/>
       <w:numFmt w:val="decimal"/>
-      <w:pStyle w:val="Listaconnmeros2"/>
+      <w:pStyle w:val="ListNumber2"/>
       <w:lvlText w:val="%1."/>
       <w:lvlJc w:val="left"/>
       <w:pPr>
@@ -901,7 +1158,7 @@
     <w:lvl w:ilvl="0">
       <w:start w:val="1"/>
       <w:numFmt w:val="bullet"/>
-      <w:pStyle w:val="Listaconvietas3"/>
+      <w:pStyle w:val="ListBullet3"/>
       <w:lvlText w:val=""/>
       <w:lvlJc w:val="left"/>
       <w:pPr>
@@ -922,7 +1179,7 @@
     <w:lvl w:ilvl="0">
       <w:start w:val="1"/>
       <w:numFmt w:val="bullet"/>
-      <w:pStyle w:val="Listaconvietas2"/>
+      <w:pStyle w:val="ListBullet2"/>
       <w:lvlText w:val=""/>
       <w:lvlJc w:val="left"/>
       <w:pPr>
@@ -943,7 +1200,7 @@
     <w:lvl w:ilvl="0">
       <w:start w:val="1"/>
       <w:numFmt w:val="decimal"/>
-      <w:pStyle w:val="Listaconnmeros"/>
+      <w:pStyle w:val="ListNumber"/>
       <w:lvlText w:val="%1."/>
       <w:lvlJc w:val="left"/>
       <w:pPr>
@@ -961,7 +1218,7 @@
     <w:lvl w:ilvl="0">
       <w:start w:val="1"/>
       <w:numFmt w:val="bullet"/>
-      <w:pStyle w:val="Listaconvietas"/>
+      <w:pStyle w:val="ListBullet"/>
       <w:lvlText w:val=""/>
       <w:lvlJc w:val="left"/>
       <w:pPr>
@@ -1006,7 +1263,7 @@
 </file>
 
 <file path=word/styles.xml><?xml version="1.0" encoding="utf-8"?>
-<w:styles xmlns:r="http://schemas.openxmlformats.org/officeDocument/2006/relationships" xmlns:w="http://schemas.openxmlformats.org/wordprocessingml/2006/main">
+<w:styles xmlns:mc="http://schemas.openxmlformats.org/markup-compatibility/2006" xmlns:r="http://schemas.openxmlformats.org/officeDocument/2006/relationships" xmlns:w="http://schemas.openxmlformats.org/wordprocessingml/2006/main" xmlns:w14="http://schemas.microsoft.com/office/word/2010/wordml" mc:Ignorable="w14">
   <w:docDefaults>
     <w:rPrDefault>
       <w:rPr>
@@ -1022,7 +1279,7 @@
       </w:pPr>
     </w:pPrDefault>
   </w:docDefaults>
-  <w:latentStyles w:defLockedState="0" w:defUIPriority="99" w:defSemiHidden="1" w:defUnhideWhenUsed="1" w:defQFormat="0" w:count="267">
+  <w:latentStyles w:defLockedState="0" w:defUIPriority="99" w:defSemiHidden="1" w:defUnhideWhenUsed="1" w:defQFormat="0" w:count="276">
     <w:lsdException w:name="Normal" w:semiHidden="0" w:uiPriority="0" w:unhideWhenUsed="0" w:qFormat="1"/>
     <w:lsdException w:name="heading 1" w:semiHidden="0" w:uiPriority="9" w:unhideWhenUsed="0" w:qFormat="1"/>
     <w:lsdException w:name="heading 2" w:uiPriority="9" w:qFormat="1"/>
@@ -1165,19 +1422,60 @@
     <w:name w:val="Normal"/>
     <w:qFormat/>
     <w:rsid w:val="00FC693F"/>
-    <w:pPr>
-      <w:spacing w:after="30"/>
-    </w:pPr>
     <w:rPr>
       <w:rFonts w:ascii="Arial" w:hAnsi="Arial"/>
-      <w:sz w:val="16"/>
+      <w:sz w:val="18"/>
     </w:rPr>
   </w:style>
-  <w:style w:type="paragraph" w:styleId="Ttulo1">
+  <w:style w:type="paragraph" w:styleId="Header">
+    <w:name w:val="header"/>
+    <w:basedOn w:val="Normal"/>
+    <w:link w:val="HeaderChar"/>
+    <w:uiPriority w:val="99"/>
+    <w:unhideWhenUsed/>
+    <w:rsid w:val="00E618BF"/>
+    <w:pPr>
+      <w:tabs>
+        <w:tab w:val="center" w:pos="4680"/>
+        <w:tab w:val="right" w:pos="9360"/>
+      </w:tabs>
+      <w:spacing w:after="0" w:line="240" w:lineRule="auto"/>
+    </w:pPr>
+  </w:style>
+  <w:style w:type="character" w:customStyle="1" w:styleId="HeaderChar">
+    <w:name w:val="Header Char"/>
+    <w:basedOn w:val="DefaultParagraphFont"/>
+    <w:link w:val="Header"/>
+    <w:uiPriority w:val="99"/>
+    <w:rsid w:val="00E618BF"/>
+  </w:style>
+  <w:style w:type="paragraph" w:styleId="Footer">
+    <w:name w:val="footer"/>
+    <w:basedOn w:val="Normal"/>
+    <w:link w:val="FooterChar"/>
+    <w:uiPriority w:val="99"/>
+    <w:unhideWhenUsed/>
+    <w:rsid w:val="00E618BF"/>
+    <w:pPr>
+      <w:tabs>
+        <w:tab w:val="center" w:pos="4680"/>
+        <w:tab w:val="right" w:pos="9360"/>
+      </w:tabs>
+      <w:spacing w:after="0" w:line="240" w:lineRule="auto"/>
+    </w:pPr>
+  </w:style>
+  <w:style w:type="character" w:customStyle="1" w:styleId="FooterChar">
+    <w:name w:val="Footer Char"/>
+    <w:basedOn w:val="DefaultParagraphFont"/>
+    <w:link w:val="Footer"/>
+    <w:uiPriority w:val="99"/>
+    <w:rsid w:val="00E618BF"/>
+  </w:style>
+  <w:style w:type="paragraph" w:styleId="Heading1">
     <w:name w:val="heading 1"/>
     <w:basedOn w:val="Normal"/>
     <w:next w:val="Normal"/>
-    <w:link w:val="Ttulo1Car"/>
+    <w:link w:val="Heading1Char"/>
     <w:uiPriority w:val="9"/>
     <w:qFormat/>
     <w:rsid w:val="00FC693F"/>
@@ -1188,7 +1486,7 @@
       <w:outlineLvl w:val="0"/>
     </w:pPr>
     <w:rPr>
-      <w:rFonts w:asciiTheme="majorHAnsi" w:eastAsiaTheme="majorEastAsia" w:hAnsiTheme="majorHAnsi" w:cstheme="majorBidi"/>
+      <w:rFonts w:asciiTheme="majorHAnsi" w:eastAsiaTheme="majorEastAsia" w:hAnsiTheme="majorHAnsi" w:cstheme="majorBidi" w:ascii="Arial" w:hAnsi="Arial"/>
       <w:b/>
       <w:bCs/>
       <w:color w:val="365F91" w:themeColor="accent1" w:themeShade="BF"/>
@@ -1196,11 +1494,11 @@
       <w:szCs w:val="28"/>
     </w:rPr>
   </w:style>
-  <w:style w:type="paragraph" w:styleId="Ttulo2">
+  <w:style w:type="paragraph" w:styleId="Heading2">
     <w:name w:val="heading 2"/>
     <w:basedOn w:val="Normal"/>
     <w:next w:val="Normal"/>
-    <w:link w:val="Ttulo2Car"/>
+    <w:link w:val="Heading2Char"/>
     <w:uiPriority w:val="9"/>
     <w:unhideWhenUsed/>
     <w:qFormat/>
@@ -1212,7 +1510,7 @@
       <w:outlineLvl w:val="1"/>
     </w:pPr>
     <w:rPr>
-      <w:rFonts w:asciiTheme="majorHAnsi" w:eastAsiaTheme="majorEastAsia" w:hAnsiTheme="majorHAnsi" w:cstheme="majorBidi"/>
+      <w:rFonts w:asciiTheme="majorHAnsi" w:eastAsiaTheme="majorEastAsia" w:hAnsiTheme="majorHAnsi" w:cstheme="majorBidi" w:ascii="Arial" w:hAnsi="Arial"/>
       <w:b/>
       <w:bCs/>
       <w:color w:val="4F81BD" w:themeColor="accent1"/>
@@ -1220,11 +1518,11 @@
       <w:szCs w:val="26"/>
     </w:rPr>
   </w:style>
-  <w:style w:type="paragraph" w:styleId="Ttulo3">
+  <w:style w:type="paragraph" w:styleId="Heading3">
     <w:name w:val="heading 3"/>
     <w:basedOn w:val="Normal"/>
     <w:next w:val="Normal"/>
-    <w:link w:val="Ttulo3Car"/>
+    <w:link w:val="Heading3Char"/>
     <w:uiPriority w:val="9"/>
     <w:unhideWhenUsed/>
     <w:qFormat/>
@@ -1242,11 +1540,11 @@
       <w:color w:val="4F81BD" w:themeColor="accent1"/>
     </w:rPr>
   </w:style>
-  <w:style w:type="paragraph" w:styleId="Ttulo4">
+  <w:style w:type="paragraph" w:styleId="Heading4">
     <w:name w:val="heading 4"/>
     <w:basedOn w:val="Normal"/>
     <w:next w:val="Normal"/>
-    <w:link w:val="Ttulo4Car"/>
+    <w:link w:val="Heading4Char"/>
     <w:uiPriority w:val="9"/>
     <w:semiHidden/>
     <w:unhideWhenUsed/>
@@ -1267,11 +1565,11 @@
       <w:color w:val="4F81BD" w:themeColor="accent1"/>
     </w:rPr>
   </w:style>
-  <w:style w:type="paragraph" w:styleId="Ttulo5">
+  <w:style w:type="paragraph" w:styleId="Heading5">
     <w:name w:val="heading 5"/>
     <w:basedOn w:val="Normal"/>
     <w:next w:val="Normal"/>
-    <w:link w:val="Ttulo5Car"/>
+    <w:link w:val="Heading5Char"/>
     <w:uiPriority w:val="9"/>
     <w:semiHidden/>
     <w:unhideWhenUsed/>
@@ -1288,11 +1586,11 @@
       <w:color w:val="243F60" w:themeColor="accent1" w:themeShade="7F"/>
     </w:rPr>
   </w:style>
-  <w:style w:type="paragraph" w:styleId="Ttulo6">
+  <w:style w:type="paragraph" w:styleId="Heading6">
     <w:name w:val="heading 6"/>
     <w:basedOn w:val="Normal"/>
     <w:next w:val="Normal"/>
-    <w:link w:val="Ttulo6Car"/>
+    <w:link w:val="Heading6Char"/>
     <w:uiPriority w:val="9"/>
     <w:semiHidden/>
     <w:unhideWhenUsed/>
@@ -1311,11 +1609,11 @@
       <w:color w:val="243F60" w:themeColor="accent1" w:themeShade="7F"/>
     </w:rPr>
   </w:style>
-  <w:style w:type="paragraph" w:styleId="Ttulo7">
+  <w:style w:type="paragraph" w:styleId="Heading7">
     <w:name w:val="heading 7"/>
     <w:basedOn w:val="Normal"/>
     <w:next w:val="Normal"/>
-    <w:link w:val="Ttulo7Car"/>
+    <w:link w:val="Heading7Char"/>
     <w:uiPriority w:val="9"/>
     <w:semiHidden/>
     <w:unhideWhenUsed/>
@@ -1334,11 +1632,11 @@
       <w:color w:val="404040" w:themeColor="text1" w:themeTint="BF"/>
     </w:rPr>
   </w:style>
-  <w:style w:type="paragraph" w:styleId="Ttulo8">
+  <w:style w:type="paragraph" w:styleId="Heading8">
     <w:name w:val="heading 8"/>
     <w:basedOn w:val="Normal"/>
     <w:next w:val="Normal"/>
-    <w:link w:val="Ttulo8Car"/>
+    <w:link w:val="Heading8Char"/>
     <w:uiPriority w:val="9"/>
     <w:semiHidden/>
     <w:unhideWhenUsed/>
@@ -1357,11 +1655,11 @@
       <w:szCs w:val="20"/>
     </w:rPr>
   </w:style>
-  <w:style w:type="paragraph" w:styleId="Ttulo9">
+  <w:style w:type="paragraph" w:styleId="Heading9">
     <w:name w:val="heading 9"/>
     <w:basedOn w:val="Normal"/>
     <w:next w:val="Normal"/>
-    <w:link w:val="Ttulo9Car"/>
+    <w:link w:val="Heading9Char"/>
     <w:uiPriority w:val="9"/>
     <w:semiHidden/>
     <w:unhideWhenUsed/>
@@ -1382,18 +1680,17 @@
       <w:szCs w:val="20"/>
     </w:rPr>
   </w:style>
-  <w:style w:type="character" w:default="1" w:styleId="Fuentedeprrafopredeter">
+  <w:style w:type="character" w:default="1" w:styleId="DefaultParagraphFont">
     <w:name w:val="Default Paragraph Font"/>
     <w:uiPriority w:val="1"/>
     <w:semiHidden/>
     <w:unhideWhenUsed/>
   </w:style>
-  <w:style w:type="table" w:default="1" w:styleId="Tablanormal">
+  <w:style w:type="table" w:default="1" w:styleId="TableNormal">
     <w:name w:val="Normal Table"/>
     <w:uiPriority w:val="99"/>
     <w:semiHidden/>
     <w:unhideWhenUsed/>
-    <w:qFormat/>
     <w:tblPr>
       <w:tblInd w:w="0" w:type="dxa"/>
       <w:tblCellMar>
@@ -1404,57 +1701,13 @@
       </w:tblCellMar>
     </w:tblPr>
   </w:style>
-  <w:style w:type="numbering" w:default="1" w:styleId="Sinlista">
+  <w:style w:type="numbering" w:default="1" w:styleId="NoList">
     <w:name w:val="No List"/>
     <w:uiPriority w:val="99"/>
     <w:semiHidden/>
     <w:unhideWhenUsed/>
   </w:style>
-  <w:style w:type="paragraph" w:styleId="Encabezado">
-    <w:name w:val="header"/>
-    <w:basedOn w:val="Normal"/>
-    <w:link w:val="EncabezadoCar"/>
-    <w:uiPriority w:val="99"/>
-    <w:unhideWhenUsed/>
-    <w:rsid w:val="00E618BF"/>
-    <w:pPr>
-      <w:tabs>
-        <w:tab w:val="center" w:pos="4680"/>
-        <w:tab w:val="right" w:pos="9360"/>
-      </w:tabs>
-      <w:spacing w:after="0" w:line="240" w:lineRule="auto"/>
-    </w:pPr>
-  </w:style>
-  <w:style w:type="character" w:customStyle="1" w:styleId="EncabezadoCar">
-    <w:name w:val="Encabezado Car"/>
-    <w:basedOn w:val="Fuentedeprrafopredeter"/>
-    <w:link w:val="Encabezado"/>
-    <w:uiPriority w:val="99"/>
-    <w:rsid w:val="00E618BF"/>
-  </w:style>
-  <w:style w:type="paragraph" w:styleId="Piedepgina">
-    <w:name w:val="footer"/>
-    <w:basedOn w:val="Normal"/>
-    <w:link w:val="PiedepginaCar"/>
-    <w:uiPriority w:val="99"/>
-    <w:unhideWhenUsed/>
-    <w:rsid w:val="00E618BF"/>
-    <w:pPr>
-      <w:tabs>
-        <w:tab w:val="center" w:pos="4680"/>
-        <w:tab w:val="right" w:pos="9360"/>
-      </w:tabs>
-      <w:spacing w:after="0" w:line="240" w:lineRule="auto"/>
-    </w:pPr>
-  </w:style>
-  <w:style w:type="character" w:customStyle="1" w:styleId="PiedepginaCar">
-    <w:name w:val="Pie de página Car"/>
-    <w:basedOn w:val="Fuentedeprrafopredeter"/>
-    <w:link w:val="Piedepgina"/>
-    <w:uiPriority w:val="99"/>
-    <w:rsid w:val="00E618BF"/>
-  </w:style>
-  <w:style w:type="paragraph" w:styleId="Sinespaciado">
+  <w:style w:type="paragraph" w:styleId="NoSpacing">
     <w:name w:val="No Spacing"/>
     <w:uiPriority w:val="1"/>
     <w:qFormat/>
@@ -1463,10 +1716,10 @@
       <w:spacing w:after="0" w:line="240" w:lineRule="auto"/>
     </w:pPr>
   </w:style>
-  <w:style w:type="character" w:customStyle="1" w:styleId="Ttulo1Car">
-    <w:name w:val="Título 1 Car"/>
-    <w:basedOn w:val="Fuentedeprrafopredeter"/>
-    <w:link w:val="Ttulo1"/>
+  <w:style w:type="character" w:customStyle="1" w:styleId="Heading1Char">
+    <w:name w:val="Heading 1 Char"/>
+    <w:basedOn w:val="DefaultParagraphFont"/>
+    <w:link w:val="Heading1"/>
     <w:uiPriority w:val="9"/>
     <w:rsid w:val="00FC693F"/>
     <w:rPr>
@@ -1478,10 +1731,10 @@
       <w:szCs w:val="28"/>
     </w:rPr>
   </w:style>
-  <w:style w:type="character" w:customStyle="1" w:styleId="Ttulo2Car">
-    <w:name w:val="Título 2 Car"/>
-    <w:basedOn w:val="Fuentedeprrafopredeter"/>
-    <w:link w:val="Ttulo2"/>
+  <w:style w:type="character" w:customStyle="1" w:styleId="Heading2Char">
+    <w:name w:val="Heading 2 Char"/>
+    <w:basedOn w:val="DefaultParagraphFont"/>
+    <w:link w:val="Heading2"/>
     <w:uiPriority w:val="9"/>
     <w:rsid w:val="00FC693F"/>
     <w:rPr>
@@ -1493,10 +1746,10 @@
       <w:szCs w:val="26"/>
     </w:rPr>
   </w:style>
-  <w:style w:type="character" w:customStyle="1" w:styleId="Ttulo3Car">
-    <w:name w:val="Título 3 Car"/>
-    <w:basedOn w:val="Fuentedeprrafopredeter"/>
-    <w:link w:val="Ttulo3"/>
+  <w:style w:type="character" w:customStyle="1" w:styleId="Heading3Char">
+    <w:name w:val="Heading 3 Char"/>
+    <w:basedOn w:val="DefaultParagraphFont"/>
+    <w:link w:val="Heading3"/>
     <w:uiPriority w:val="9"/>
     <w:rsid w:val="00FC693F"/>
     <w:rPr>
@@ -1506,11 +1759,11 @@
       <w:color w:val="4F81BD" w:themeColor="accent1"/>
     </w:rPr>
   </w:style>
-  <w:style w:type="paragraph" w:styleId="Ttulo">
+  <w:style w:type="paragraph" w:styleId="Title">
     <w:name w:val="Title"/>
     <w:basedOn w:val="Normal"/>
     <w:next w:val="Normal"/>
-    <w:link w:val="TtuloCar"/>
+    <w:link w:val="TitleChar"/>
     <w:uiPriority w:val="10"/>
     <w:qFormat/>
     <w:rsid w:val="00FC693F"/>
@@ -1522,7 +1775,7 @@
       <w:contextualSpacing/>
     </w:pPr>
     <w:rPr>
-      <w:rFonts w:asciiTheme="majorHAnsi" w:eastAsiaTheme="majorEastAsia" w:hAnsiTheme="majorHAnsi" w:cstheme="majorBidi"/>
+      <w:rFonts w:asciiTheme="majorHAnsi" w:eastAsiaTheme="majorEastAsia" w:hAnsiTheme="majorHAnsi" w:cstheme="majorBidi" w:ascii="Arial" w:hAnsi="Arial"/>
       <w:color w:val="17365D" w:themeColor="text2" w:themeShade="BF"/>
       <w:spacing w:val="5"/>
       <w:kern w:val="28"/>
@@ -1530,10 +1783,10 @@
       <w:szCs w:val="52"/>
     </w:rPr>
   </w:style>
-  <w:style w:type="character" w:customStyle="1" w:styleId="TtuloCar">
-    <w:name w:val="Título Car"/>
-    <w:basedOn w:val="Fuentedeprrafopredeter"/>
-    <w:link w:val="Ttulo"/>
+  <w:style w:type="character" w:customStyle="1" w:styleId="TitleChar">
+    <w:name w:val="Title Char"/>
+    <w:basedOn w:val="DefaultParagraphFont"/>
+    <w:link w:val="Title"/>
     <w:uiPriority w:val="10"/>
     <w:rsid w:val="00FC693F"/>
     <w:rPr>
@@ -1545,11 +1798,11 @@
       <w:szCs w:val="52"/>
     </w:rPr>
   </w:style>
-  <w:style w:type="paragraph" w:styleId="Subttulo">
+  <w:style w:type="paragraph" w:styleId="Subtitle">
     <w:name w:val="Subtitle"/>
     <w:basedOn w:val="Normal"/>
     <w:next w:val="Normal"/>
-    <w:link w:val="SubttuloCar"/>
+    <w:link w:val="SubtitleChar"/>
     <w:uiPriority w:val="11"/>
     <w:qFormat/>
     <w:rsid w:val="00FC693F"/>
@@ -1568,10 +1821,10 @@
       <w:szCs w:val="24"/>
     </w:rPr>
   </w:style>
-  <w:style w:type="character" w:customStyle="1" w:styleId="SubttuloCar">
-    <w:name w:val="Subtítulo Car"/>
-    <w:basedOn w:val="Fuentedeprrafopredeter"/>
-    <w:link w:val="Subttulo"/>
+  <w:style w:type="character" w:customStyle="1" w:styleId="SubtitleChar">
+    <w:name w:val="Subtitle Char"/>
+    <w:basedOn w:val="DefaultParagraphFont"/>
+    <w:link w:val="Subtitle"/>
     <w:uiPriority w:val="11"/>
     <w:rsid w:val="00FC693F"/>
     <w:rPr>
@@ -1584,7 +1837,7 @@
       <w:szCs w:val="24"/>
     </w:rPr>
   </w:style>
-  <w:style w:type="paragraph" w:styleId="Prrafodelista">
+  <w:style w:type="paragraph" w:styleId="ListParagraph">
     <w:name w:val="List Paragraph"/>
     <w:basedOn w:val="Normal"/>
     <w:uiPriority w:val="34"/>
@@ -1595,10 +1848,10 @@
       <w:contextualSpacing/>
     </w:pPr>
   </w:style>
-  <w:style w:type="paragraph" w:styleId="Textoindependiente">
+  <w:style w:type="paragraph" w:styleId="BodyText">
     <w:name w:val="Body Text"/>
     <w:basedOn w:val="Normal"/>
-    <w:link w:val="TextoindependienteCar"/>
+    <w:link w:val="BodyTextChar"/>
     <w:uiPriority w:val="99"/>
     <w:unhideWhenUsed/>
     <w:rsid w:val="00AA1D8D"/>
@@ -1606,17 +1859,17 @@
       <w:spacing w:after="120"/>
     </w:pPr>
   </w:style>
-  <w:style w:type="character" w:customStyle="1" w:styleId="TextoindependienteCar">
-    <w:name w:val="Texto independiente Car"/>
-    <w:basedOn w:val="Fuentedeprrafopredeter"/>
-    <w:link w:val="Textoindependiente"/>
+  <w:style w:type="character" w:customStyle="1" w:styleId="BodyTextChar">
+    <w:name w:val="Body Text Char"/>
+    <w:basedOn w:val="DefaultParagraphFont"/>
+    <w:link w:val="BodyText"/>
     <w:uiPriority w:val="99"/>
     <w:rsid w:val="00AA1D8D"/>
   </w:style>
-  <w:style w:type="paragraph" w:styleId="Textoindependiente2">
+  <w:style w:type="paragraph" w:styleId="BodyText2">
     <w:name w:val="Body Text 2"/>
     <w:basedOn w:val="Normal"/>
-    <w:link w:val="Textoindependiente2Car"/>
+    <w:link w:val="BodyText2Char"/>
     <w:uiPriority w:val="99"/>
     <w:unhideWhenUsed/>
     <w:rsid w:val="00AA1D8D"/>
@@ -1624,17 +1877,17 @@
       <w:spacing w:after="120" w:line="480" w:lineRule="auto"/>
     </w:pPr>
   </w:style>
-  <w:style w:type="character" w:customStyle="1" w:styleId="Textoindependiente2Car">
-    <w:name w:val="Texto independiente 2 Car"/>
-    <w:basedOn w:val="Fuentedeprrafopredeter"/>
-    <w:link w:val="Textoindependiente2"/>
+  <w:style w:type="character" w:customStyle="1" w:styleId="BodyText2Char">
+    <w:name w:val="Body Text 2 Char"/>
+    <w:basedOn w:val="DefaultParagraphFont"/>
+    <w:link w:val="BodyText2"/>
     <w:uiPriority w:val="99"/>
     <w:rsid w:val="00AA1D8D"/>
   </w:style>
-  <w:style w:type="paragraph" w:styleId="Textoindependiente3">
+  <w:style w:type="paragraph" w:styleId="BodyText3">
     <w:name w:val="Body Text 3"/>
     <w:basedOn w:val="Normal"/>
-    <w:link w:val="Textoindependiente3Car"/>
+    <w:link w:val="BodyText3Char"/>
     <w:uiPriority w:val="99"/>
     <w:unhideWhenUsed/>
     <w:rsid w:val="00AA1D8D"/>
@@ -1642,13 +1895,14 @@
       <w:spacing w:after="120"/>
     </w:pPr>
     <w:rPr>
+      <w:sz w:val="16"/>
       <w:szCs w:val="16"/>
     </w:rPr>
   </w:style>
-  <w:style w:type="character" w:customStyle="1" w:styleId="Textoindependiente3Car">
-    <w:name w:val="Texto independiente 3 Car"/>
-    <w:basedOn w:val="Fuentedeprrafopredeter"/>
-    <w:link w:val="Textoindependiente3"/>
+  <w:style w:type="character" w:customStyle="1" w:styleId="BodyText3Char">
+    <w:name w:val="Body Text 3 Char"/>
+    <w:basedOn w:val="DefaultParagraphFont"/>
+    <w:link w:val="BodyText3"/>
     <w:uiPriority w:val="99"/>
     <w:rsid w:val="00AA1D8D"/>
     <w:rPr>
@@ -1656,7 +1910,7 @@
       <w:szCs w:val="16"/>
     </w:rPr>
   </w:style>
-  <w:style w:type="paragraph" w:styleId="Lista">
+  <w:style w:type="paragraph" w:styleId="List">
     <w:name w:val="List"/>
     <w:basedOn w:val="Normal"/>
     <w:uiPriority w:val="99"/>
@@ -1667,7 +1921,7 @@
       <w:contextualSpacing/>
     </w:pPr>
   </w:style>
-  <w:style w:type="paragraph" w:styleId="Lista2">
+  <w:style w:type="paragraph" w:styleId="List2">
     <w:name w:val="List 2"/>
     <w:basedOn w:val="Normal"/>
     <w:uiPriority w:val="99"/>
@@ -1678,7 +1932,7 @@
       <w:contextualSpacing/>
     </w:pPr>
   </w:style>
-  <w:style w:type="paragraph" w:styleId="Lista3">
+  <w:style w:type="paragraph" w:styleId="List3">
     <w:name w:val="List 3"/>
     <w:basedOn w:val="Normal"/>
     <w:uiPriority w:val="99"/>
@@ -1689,7 +1943,7 @@
       <w:contextualSpacing/>
     </w:pPr>
   </w:style>
-  <w:style w:type="paragraph" w:styleId="Listaconvietas">
+  <w:style w:type="paragraph" w:styleId="ListBullet">
     <w:name w:val="List Bullet"/>
     <w:basedOn w:val="Normal"/>
     <w:uiPriority w:val="99"/>
@@ -1702,7 +1956,7 @@
       <w:contextualSpacing/>
     </w:pPr>
   </w:style>
-  <w:style w:type="paragraph" w:styleId="Listaconvietas2">
+  <w:style w:type="paragraph" w:styleId="ListBullet2">
     <w:name w:val="List Bullet 2"/>
     <w:basedOn w:val="Normal"/>
     <w:uiPriority w:val="99"/>
@@ -1715,7 +1969,7 @@
       <w:contextualSpacing/>
     </w:pPr>
   </w:style>
-  <w:style w:type="paragraph" w:styleId="Listaconvietas3">
+  <w:style w:type="paragraph" w:styleId="ListBullet3">
     <w:name w:val="List Bullet 3"/>
     <w:basedOn w:val="Normal"/>
     <w:uiPriority w:val="99"/>
@@ -1728,7 +1982,7 @@
       <w:contextualSpacing/>
     </w:pPr>
   </w:style>
-  <w:style w:type="paragraph" w:styleId="Listaconnmeros">
+  <w:style w:type="paragraph" w:styleId="ListNumber">
     <w:name w:val="List Number"/>
     <w:basedOn w:val="Normal"/>
     <w:uiPriority w:val="99"/>
@@ -1741,7 +1995,7 @@
       <w:contextualSpacing/>
     </w:pPr>
   </w:style>
-  <w:style w:type="paragraph" w:styleId="Listaconnmeros2">
+  <w:style w:type="paragraph" w:styleId="ListNumber2">
     <w:name w:val="List Number 2"/>
     <w:basedOn w:val="Normal"/>
     <w:uiPriority w:val="99"/>
@@ -1754,7 +2008,7 @@
       <w:contextualSpacing/>
     </w:pPr>
   </w:style>
-  <w:style w:type="paragraph" w:styleId="Listaconnmeros3">
+  <w:style w:type="paragraph" w:styleId="ListNumber3">
     <w:name w:val="List Number 3"/>
     <w:basedOn w:val="Normal"/>
     <w:uiPriority w:val="99"/>
@@ -1767,7 +2021,7 @@
       <w:contextualSpacing/>
     </w:pPr>
   </w:style>
-  <w:style w:type="paragraph" w:styleId="Continuarlista">
+  <w:style w:type="paragraph" w:styleId="ListContinue">
     <w:name w:val="List Continue"/>
     <w:basedOn w:val="Normal"/>
     <w:uiPriority w:val="99"/>
@@ -1779,7 +2033,7 @@
       <w:contextualSpacing/>
     </w:pPr>
   </w:style>
-  <w:style w:type="paragraph" w:styleId="Continuarlista2">
+  <w:style w:type="paragraph" w:styleId="ListContinue2">
     <w:name w:val="List Continue 2"/>
     <w:basedOn w:val="Normal"/>
     <w:uiPriority w:val="99"/>
@@ -1791,7 +2045,7 @@
       <w:contextualSpacing/>
     </w:pPr>
   </w:style>
-  <w:style w:type="paragraph" w:styleId="Continuarlista3">
+  <w:style w:type="paragraph" w:styleId="ListContinue3">
     <w:name w:val="List Continue 3"/>
     <w:basedOn w:val="Normal"/>
     <w:uiPriority w:val="99"/>
@@ -1803,9 +2057,9 @@
       <w:contextualSpacing/>
     </w:pPr>
   </w:style>
-  <w:style w:type="paragraph" w:styleId="Textomacro">
+  <w:style w:type="paragraph" w:styleId="MacroText">
     <w:name w:val="macro"/>
-    <w:link w:val="TextomacroCar"/>
+    <w:link w:val="MacroTextChar"/>
     <w:uiPriority w:val="99"/>
     <w:unhideWhenUsed/>
     <w:rsid w:val="0029639D"/>
@@ -1826,10 +2080,10 @@
       <w:szCs w:val="20"/>
     </w:rPr>
   </w:style>
-  <w:style w:type="character" w:customStyle="1" w:styleId="TextomacroCar">
-    <w:name w:val="Texto macro Car"/>
-    <w:basedOn w:val="Fuentedeprrafopredeter"/>
-    <w:link w:val="Textomacro"/>
+  <w:style w:type="character" w:customStyle="1" w:styleId="MacroTextChar">
+    <w:name w:val="Macro Text Char"/>
+    <w:basedOn w:val="DefaultParagraphFont"/>
+    <w:link w:val="MacroText"/>
     <w:uiPriority w:val="99"/>
     <w:rsid w:val="0029639D"/>
     <w:rPr>
@@ -1838,11 +2092,11 @@
       <w:szCs w:val="20"/>
     </w:rPr>
   </w:style>
-  <w:style w:type="paragraph" w:styleId="Cita">
+  <w:style w:type="paragraph" w:styleId="Quote">
     <w:name w:val="Quote"/>
     <w:basedOn w:val="Normal"/>
     <w:next w:val="Normal"/>
-    <w:link w:val="CitaCar"/>
+    <w:link w:val="QuoteChar"/>
     <w:uiPriority w:val="29"/>
     <w:qFormat/>
     <w:rsid w:val="00FC693F"/>
@@ -1852,10 +2106,10 @@
       <w:color w:val="000000" w:themeColor="text1"/>
     </w:rPr>
   </w:style>
-  <w:style w:type="character" w:customStyle="1" w:styleId="CitaCar">
-    <w:name w:val="Cita Car"/>
-    <w:basedOn w:val="Fuentedeprrafopredeter"/>
-    <w:link w:val="Cita"/>
+  <w:style w:type="character" w:customStyle="1" w:styleId="QuoteChar">
+    <w:name w:val="Quote Char"/>
+    <w:basedOn w:val="DefaultParagraphFont"/>
+    <w:link w:val="Quote"/>
     <w:uiPriority w:val="29"/>
     <w:rsid w:val="00FC693F"/>
     <w:rPr>
@@ -1864,10 +2118,10 @@
       <w:color w:val="000000" w:themeColor="text1"/>
     </w:rPr>
   </w:style>
-  <w:style w:type="character" w:customStyle="1" w:styleId="Ttulo4Car">
-    <w:name w:val="Título 4 Car"/>
-    <w:basedOn w:val="Fuentedeprrafopredeter"/>
-    <w:link w:val="Ttulo4"/>
+  <w:style w:type="character" w:customStyle="1" w:styleId="Heading4Char">
+    <w:name w:val="Heading 4 Char"/>
+    <w:basedOn w:val="DefaultParagraphFont"/>
+    <w:link w:val="Heading4"/>
     <w:uiPriority w:val="9"/>
     <w:semiHidden/>
     <w:rsid w:val="00FC693F"/>
@@ -1880,10 +2134,10 @@
       <w:color w:val="4F81BD" w:themeColor="accent1"/>
     </w:rPr>
   </w:style>
-  <w:style w:type="character" w:customStyle="1" w:styleId="Ttulo5Car">
-    <w:name w:val="Título 5 Car"/>
-    <w:basedOn w:val="Fuentedeprrafopredeter"/>
-    <w:link w:val="Ttulo5"/>
+  <w:style w:type="character" w:customStyle="1" w:styleId="Heading5Char">
+    <w:name w:val="Heading 5 Char"/>
+    <w:basedOn w:val="DefaultParagraphFont"/>
+    <w:link w:val="Heading5"/>
     <w:uiPriority w:val="9"/>
     <w:semiHidden/>
     <w:rsid w:val="00FC693F"/>
@@ -1892,10 +2146,10 @@
       <w:color w:val="243F60" w:themeColor="accent1" w:themeShade="7F"/>
     </w:rPr>
   </w:style>
-  <w:style w:type="character" w:customStyle="1" w:styleId="Ttulo6Car">
-    <w:name w:val="Título 6 Car"/>
-    <w:basedOn w:val="Fuentedeprrafopredeter"/>
-    <w:link w:val="Ttulo6"/>
+  <w:style w:type="character" w:customStyle="1" w:styleId="Heading6Char">
+    <w:name w:val="Heading 6 Char"/>
+    <w:basedOn w:val="DefaultParagraphFont"/>
+    <w:link w:val="Heading6"/>
     <w:uiPriority w:val="9"/>
     <w:semiHidden/>
     <w:rsid w:val="00FC693F"/>
@@ -1906,10 +2160,10 @@
       <w:color w:val="243F60" w:themeColor="accent1" w:themeShade="7F"/>
     </w:rPr>
   </w:style>
-  <w:style w:type="character" w:customStyle="1" w:styleId="Ttulo7Car">
-    <w:name w:val="Título 7 Car"/>
-    <w:basedOn w:val="Fuentedeprrafopredeter"/>
-    <w:link w:val="Ttulo7"/>
+  <w:style w:type="character" w:customStyle="1" w:styleId="Heading7Char">
+    <w:name w:val="Heading 7 Char"/>
+    <w:basedOn w:val="DefaultParagraphFont"/>
+    <w:link w:val="Heading7"/>
     <w:uiPriority w:val="9"/>
     <w:semiHidden/>
     <w:rsid w:val="00FC693F"/>
@@ -1920,10 +2174,10 @@
       <w:color w:val="404040" w:themeColor="text1" w:themeTint="BF"/>
     </w:rPr>
   </w:style>
-  <w:style w:type="character" w:customStyle="1" w:styleId="Ttulo8Car">
-    <w:name w:val="Título 8 Car"/>
-    <w:basedOn w:val="Fuentedeprrafopredeter"/>
-    <w:link w:val="Ttulo8"/>
+  <w:style w:type="character" w:customStyle="1" w:styleId="Heading8Char">
+    <w:name w:val="Heading 8 Char"/>
+    <w:basedOn w:val="DefaultParagraphFont"/>
+    <w:link w:val="Heading8"/>
     <w:uiPriority w:val="9"/>
     <w:semiHidden/>
     <w:rsid w:val="00FC693F"/>
@@ -1934,10 +2188,10 @@
       <w:szCs w:val="20"/>
     </w:rPr>
   </w:style>
-  <w:style w:type="character" w:customStyle="1" w:styleId="Ttulo9Car">
-    <w:name w:val="Título 9 Car"/>
-    <w:basedOn w:val="Fuentedeprrafopredeter"/>
-    <w:link w:val="Ttulo9"/>
+  <w:style w:type="character" w:customStyle="1" w:styleId="Heading9Char">
+    <w:name w:val="Heading 9 Char"/>
+    <w:basedOn w:val="DefaultParagraphFont"/>
+    <w:link w:val="Heading9"/>
     <w:uiPriority w:val="9"/>
     <w:semiHidden/>
     <w:rsid w:val="00FC693F"/>
@@ -1950,7 +2204,7 @@
       <w:szCs w:val="20"/>
     </w:rPr>
   </w:style>
-  <w:style w:type="paragraph" w:styleId="Epgrafe">
+  <w:style w:type="paragraph" w:styleId="Caption">
     <w:name w:val="caption"/>
     <w:basedOn w:val="Normal"/>
     <w:next w:val="Normal"/>
@@ -1970,9 +2224,9 @@
       <w:szCs w:val="18"/>
     </w:rPr>
   </w:style>
-  <w:style w:type="character" w:styleId="Textoennegrita">
+  <w:style w:type="character" w:styleId="Strong">
     <w:name w:val="Strong"/>
-    <w:basedOn w:val="Fuentedeprrafopredeter"/>
+    <w:basedOn w:val="DefaultParagraphFont"/>
     <w:uiPriority w:val="22"/>
     <w:qFormat/>
     <w:rsid w:val="00FC693F"/>
@@ -1981,9 +2235,9 @@
       <w:bCs/>
     </w:rPr>
   </w:style>
-  <w:style w:type="character" w:styleId="nfasis">
+  <w:style w:type="character" w:styleId="Emphasis">
     <w:name w:val="Emphasis"/>
-    <w:basedOn w:val="Fuentedeprrafopredeter"/>
+    <w:basedOn w:val="DefaultParagraphFont"/>
     <w:uiPriority w:val="20"/>
     <w:qFormat/>
     <w:rsid w:val="00FC693F"/>
@@ -1992,11 +2246,11 @@
       <w:iCs/>
     </w:rPr>
   </w:style>
-  <w:style w:type="paragraph" w:styleId="Citadestacada">
+  <w:style w:type="paragraph" w:styleId="IntenseQuote">
     <w:name w:val="Intense Quote"/>
     <w:basedOn w:val="Normal"/>
     <w:next w:val="Normal"/>
-    <w:link w:val="CitadestacadaCar"/>
+    <w:link w:val="IntenseQuoteChar"/>
     <w:uiPriority w:val="30"/>
     <w:qFormat/>
     <w:rsid w:val="00FC693F"/>
@@ -2015,10 +2269,10 @@
       <w:color w:val="4F81BD" w:themeColor="accent1"/>
     </w:rPr>
   </w:style>
-  <w:style w:type="character" w:customStyle="1" w:styleId="CitadestacadaCar">
-    <w:name w:val="Cita destacada Car"/>
-    <w:basedOn w:val="Fuentedeprrafopredeter"/>
-    <w:link w:val="Citadestacada"/>
+  <w:style w:type="character" w:customStyle="1" w:styleId="IntenseQuoteChar">
+    <w:name w:val="Intense Quote Char"/>
+    <w:basedOn w:val="DefaultParagraphFont"/>
+    <w:link w:val="IntenseQuote"/>
     <w:uiPriority w:val="30"/>
     <w:rsid w:val="00FC693F"/>
     <w:rPr>
@@ -2029,9 +2283,9 @@
       <w:color w:val="4F81BD" w:themeColor="accent1"/>
     </w:rPr>
   </w:style>
-  <w:style w:type="character" w:styleId="nfasissutil">
+  <w:style w:type="character" w:styleId="SubtleEmphasis">
     <w:name w:val="Subtle Emphasis"/>
-    <w:basedOn w:val="Fuentedeprrafopredeter"/>
+    <w:basedOn w:val="DefaultParagraphFont"/>
     <w:uiPriority w:val="19"/>
     <w:qFormat/>
     <w:rsid w:val="00FC693F"/>
@@ -2041,9 +2295,9 @@
       <w:color w:val="808080" w:themeColor="text1" w:themeTint="7F"/>
     </w:rPr>
   </w:style>
-  <w:style w:type="character" w:styleId="nfasisintenso">
+  <w:style w:type="character" w:styleId="IntenseEmphasis">
     <w:name w:val="Intense Emphasis"/>
-    <w:basedOn w:val="Fuentedeprrafopredeter"/>
+    <w:basedOn w:val="DefaultParagraphFont"/>
     <w:uiPriority w:val="21"/>
     <w:qFormat/>
     <w:rsid w:val="00FC693F"/>
@@ -2055,9 +2309,9 @@
       <w:color w:val="4F81BD" w:themeColor="accent1"/>
     </w:rPr>
   </w:style>
-  <w:style w:type="character" w:styleId="Referenciasutil">
+  <w:style w:type="character" w:styleId="SubtleReference">
     <w:name w:val="Subtle Reference"/>
-    <w:basedOn w:val="Fuentedeprrafopredeter"/>
+    <w:basedOn w:val="DefaultParagraphFont"/>
     <w:uiPriority w:val="31"/>
     <w:qFormat/>
     <w:rsid w:val="00FC693F"/>
@@ -2067,9 +2321,9 @@
       <w:u w:val="single"/>
     </w:rPr>
   </w:style>
-  <w:style w:type="character" w:styleId="Referenciaintensa">
+  <w:style w:type="character" w:styleId="IntenseReference">
     <w:name w:val="Intense Reference"/>
-    <w:basedOn w:val="Fuentedeprrafopredeter"/>
+    <w:basedOn w:val="DefaultParagraphFont"/>
     <w:uiPriority w:val="32"/>
     <w:qFormat/>
     <w:rsid w:val="00FC693F"/>
@@ -2082,9 +2336,9 @@
       <w:u w:val="single"/>
     </w:rPr>
   </w:style>
-  <w:style w:type="character" w:styleId="Ttulodellibro">
+  <w:style w:type="character" w:styleId="BookTitle">
     <w:name w:val="Book Title"/>
-    <w:basedOn w:val="Fuentedeprrafopredeter"/>
+    <w:basedOn w:val="DefaultParagraphFont"/>
     <w:uiPriority w:val="33"/>
     <w:qFormat/>
     <w:rsid w:val="00FC693F"/>
@@ -2095,9 +2349,9 @@
       <w:spacing w:val="5"/>
     </w:rPr>
   </w:style>
-  <w:style w:type="paragraph" w:styleId="TtulodeTDC">
+  <w:style w:type="paragraph" w:styleId="TOCHeading">
     <w:name w:val="TOC Heading"/>
-    <w:basedOn w:val="Ttulo1"/>
+    <w:basedOn w:val="Heading1"/>
     <w:next w:val="Normal"/>
     <w:uiPriority w:val="39"/>
     <w:semiHidden/>
@@ -2108,9 +2362,9 @@
       <w:outlineLvl w:val="9"/>
     </w:pPr>
   </w:style>
-  <w:style w:type="table" w:styleId="Tablaconcuadrcula">
+  <w:style w:type="table" w:styleId="TableGrid">
     <w:name w:val="Table Grid"/>
-    <w:basedOn w:val="Tablanormal"/>
+    <w:basedOn w:val="TableNormal"/>
     <w:uiPriority w:val="59"/>
     <w:rsid w:val="00FC693F"/>
     <w:pPr>
@@ -2134,9 +2388,9 @@
       </w:tblCellMar>
     </w:tblPr>
   </w:style>
-  <w:style w:type="table" w:styleId="Sombreadoclaro">
+  <w:style w:type="table" w:styleId="LightShading">
     <w:name w:val="Light Shading"/>
-    <w:basedOn w:val="Tablanormal"/>
+    <w:basedOn w:val="TableNormal"/>
     <w:uiPriority w:val="60"/>
     <w:rsid w:val="00FC693F"/>
     <w:pPr>
@@ -2237,9 +2491,9 @@
       </w:tcPr>
     </w:tblStylePr>
   </w:style>
-  <w:style w:type="table" w:styleId="Sombreadoclaro-nfasis1">
+  <w:style w:type="table" w:styleId="LightShading-Accent1">
     <w:name w:val="Light Shading Accent 1"/>
-    <w:basedOn w:val="Tablanormal"/>
+    <w:basedOn w:val="TableNormal"/>
     <w:uiPriority w:val="60"/>
     <w:rsid w:val="00FC693F"/>
     <w:pPr>
@@ -2340,9 +2594,9 @@
       </w:tcPr>
     </w:tblStylePr>
   </w:style>
-  <w:style w:type="table" w:styleId="Sombreadoclaro-nfasis2">
+  <w:style w:type="table" w:styleId="LightShading-Accent2">
     <w:name w:val="Light Shading Accent 2"/>
-    <w:basedOn w:val="Tablanormal"/>
+    <w:basedOn w:val="TableNormal"/>
     <w:uiPriority w:val="60"/>
     <w:rsid w:val="00FC693F"/>
     <w:pPr>
@@ -2443,9 +2697,9 @@
       </w:tcPr>
     </w:tblStylePr>
   </w:style>
-  <w:style w:type="table" w:styleId="Sombreadoclaro-nfasis3">
+  <w:style w:type="table" w:styleId="LightShading-Accent3">
     <w:name w:val="Light Shading Accent 3"/>
-    <w:basedOn w:val="Tablanormal"/>
+    <w:basedOn w:val="TableNormal"/>
     <w:uiPriority w:val="60"/>
     <w:rsid w:val="00FC693F"/>
     <w:pPr>
@@ -2546,9 +2800,9 @@
       </w:tcPr>
     </w:tblStylePr>
   </w:style>
-  <w:style w:type="table" w:styleId="Sombreadoclaro-nfasis4">
+  <w:style w:type="table" w:styleId="LightShading-Accent4">
     <w:name w:val="Light Shading Accent 4"/>
-    <w:basedOn w:val="Tablanormal"/>
+    <w:basedOn w:val="TableNormal"/>
     <w:uiPriority w:val="60"/>
     <w:rsid w:val="00FC693F"/>
     <w:pPr>
@@ -2649,9 +2903,9 @@
       </w:tcPr>
     </w:tblStylePr>
   </w:style>
-  <w:style w:type="table" w:styleId="Sombreadoclaro-nfasis5">
+  <w:style w:type="table" w:styleId="LightShading-Accent5">
     <w:name w:val="Light Shading Accent 5"/>
-    <w:basedOn w:val="Tablanormal"/>
+    <w:basedOn w:val="TableNormal"/>
     <w:uiPriority w:val="60"/>
     <w:rsid w:val="00FC693F"/>
     <w:pPr>
@@ -2752,9 +3006,9 @@
       </w:tcPr>
     </w:tblStylePr>
   </w:style>
-  <w:style w:type="table" w:styleId="Sombreadoclaro-nfasis6">
+  <w:style w:type="table" w:styleId="LightShading-Accent6">
     <w:name w:val="Light Shading Accent 6"/>
-    <w:basedOn w:val="Tablanormal"/>
+    <w:basedOn w:val="TableNormal"/>
     <w:uiPriority w:val="60"/>
     <w:rsid w:val="00FC693F"/>
     <w:pPr>
@@ -2855,9 +3109,9 @@
       </w:tcPr>
     </w:tblStylePr>
   </w:style>
-  <w:style w:type="table" w:styleId="Listaclara">
+  <w:style w:type="table" w:styleId="LightList">
     <w:name w:val="Light List"/>
-    <w:basedOn w:val="Tablanormal"/>
+    <w:basedOn w:val="TableNormal"/>
     <w:uiPriority w:val="61"/>
     <w:rsid w:val="00FC693F"/>
     <w:pPr>
@@ -2947,9 +3201,9 @@
       </w:tcPr>
     </w:tblStylePr>
   </w:style>
-  <w:style w:type="table" w:styleId="Listaclara-nfasis1">
+  <w:style w:type="table" w:styleId="LightList-Accent1">
     <w:name w:val="Light List Accent 1"/>
-    <w:basedOn w:val="Tablanormal"/>
+    <w:basedOn w:val="TableNormal"/>
     <w:uiPriority w:val="61"/>
     <w:rsid w:val="00FC693F"/>
     <w:pPr>
@@ -3039,9 +3293,9 @@
       </w:tcPr>
     </w:tblStylePr>
   </w:style>
-  <w:style w:type="table" w:styleId="Listaclara-nfasis2">
+  <w:style w:type="table" w:styleId="LightList-Accent2">
     <w:name w:val="Light List Accent 2"/>
-    <w:basedOn w:val="Tablanormal"/>
+    <w:basedOn w:val="TableNormal"/>
     <w:uiPriority w:val="61"/>
     <w:rsid w:val="00CB0664"/>
     <w:pPr>
@@ -3131,9 +3385,9 @@
       </w:tcPr>
     </w:tblStylePr>
   </w:style>
-  <w:style w:type="table" w:styleId="Listaclara-nfasis3">
+  <w:style w:type="table" w:styleId="LightList-Accent3">
     <w:name w:val="Light List Accent 3"/>
-    <w:basedOn w:val="Tablanormal"/>
+    <w:basedOn w:val="TableNormal"/>
     <w:uiPriority w:val="61"/>
     <w:rsid w:val="00CB0664"/>
     <w:pPr>
@@ -3223,9 +3477,9 @@
       </w:tcPr>
     </w:tblStylePr>
   </w:style>
-  <w:style w:type="table" w:styleId="Listaclara-nfasis4">
+  <w:style w:type="table" w:styleId="LightList-Accent4">
     <w:name w:val="Light List Accent 4"/>
-    <w:basedOn w:val="Tablanormal"/>
+    <w:basedOn w:val="TableNormal"/>
     <w:uiPriority w:val="61"/>
     <w:rsid w:val="00CB0664"/>
     <w:pPr>
@@ -3315,9 +3569,9 @@
       </w:tcPr>
     </w:tblStylePr>
   </w:style>
-  <w:style w:type="table" w:styleId="Listaclara-nfasis5">
+  <w:style w:type="table" w:styleId="LightList-Accent5">
     <w:name w:val="Light List Accent 5"/>
-    <w:basedOn w:val="Tablanormal"/>
+    <w:basedOn w:val="TableNormal"/>
     <w:uiPriority w:val="61"/>
     <w:rsid w:val="00CB0664"/>
     <w:pPr>
@@ -3407,9 +3661,9 @@
       </w:tcPr>
     </w:tblStylePr>
   </w:style>
-  <w:style w:type="table" w:styleId="Listaclara-nfasis6">
+  <w:style w:type="table" w:styleId="LightList-Accent6">
     <w:name w:val="Light List Accent 6"/>
-    <w:basedOn w:val="Tablanormal"/>
+    <w:basedOn w:val="TableNormal"/>
     <w:uiPriority w:val="61"/>
     <w:rsid w:val="00CB0664"/>
     <w:pPr>
@@ -3499,9 +3753,9 @@
       </w:tcPr>
     </w:tblStylePr>
   </w:style>
-  <w:style w:type="table" w:styleId="Cuadrculaclara">
+  <w:style w:type="table" w:styleId="LightGrid">
     <w:name w:val="Light Grid"/>
-    <w:basedOn w:val="Tablanormal"/>
+    <w:basedOn w:val="TableNormal"/>
     <w:uiPriority w:val="62"/>
     <w:rsid w:val="00CB0664"/>
     <w:pPr>
@@ -3629,9 +3883,9 @@
       </w:tcPr>
     </w:tblStylePr>
   </w:style>
-  <w:style w:type="table" w:styleId="Cuadrculaclara-nfasis1">
+  <w:style w:type="table" w:styleId="LightGrid-Accent1">
     <w:name w:val="Light Grid Accent 1"/>
-    <w:basedOn w:val="Tablanormal"/>
+    <w:basedOn w:val="TableNormal"/>
     <w:uiPriority w:val="62"/>
     <w:rsid w:val="00CB0664"/>
     <w:pPr>
@@ -3759,9 +4013,9 @@
       </w:tcPr>
     </w:tblStylePr>
   </w:style>
-  <w:style w:type="table" w:styleId="Cuadrculaclara-nfasis2">
+  <w:style w:type="table" w:styleId="LightGrid-Accent2">
     <w:name w:val="Light Grid Accent 2"/>
-    <w:basedOn w:val="Tablanormal"/>
+    <w:basedOn w:val="TableNormal"/>
     <w:uiPriority w:val="62"/>
     <w:rsid w:val="00CB0664"/>
     <w:pPr>
@@ -3889,9 +4143,9 @@
       </w:tcPr>
     </w:tblStylePr>
   </w:style>
-  <w:style w:type="table" w:styleId="Cuadrculaclara-nfasis3">
+  <w:style w:type="table" w:styleId="LightGrid-Accent3">
     <w:name w:val="Light Grid Accent 3"/>
-    <w:basedOn w:val="Tablanormal"/>
+    <w:basedOn w:val="TableNormal"/>
     <w:uiPriority w:val="62"/>
     <w:rsid w:val="00CB0664"/>
     <w:pPr>
@@ -4019,9 +4273,9 @@
       </w:tcPr>
     </w:tblStylePr>
   </w:style>
-  <w:style w:type="table" w:styleId="Cuadrculaclara-nfasis4">
+  <w:style w:type="table" w:styleId="LightGrid-Accent4">
     <w:name w:val="Light Grid Accent 4"/>
-    <w:basedOn w:val="Tablanormal"/>
+    <w:basedOn w:val="TableNormal"/>
     <w:uiPriority w:val="62"/>
     <w:rsid w:val="00CB0664"/>
     <w:pPr>
@@ -4149,9 +4403,9 @@
       </w:tcPr>
     </w:tblStylePr>
   </w:style>
-  <w:style w:type="table" w:styleId="Cuadrculaclara-nfasis5">
+  <w:style w:type="table" w:styleId="LightGrid-Accent5">
     <w:name w:val="Light Grid Accent 5"/>
-    <w:basedOn w:val="Tablanormal"/>
+    <w:basedOn w:val="TableNormal"/>
     <w:uiPriority w:val="62"/>
     <w:rsid w:val="00CB0664"/>
     <w:pPr>
@@ -4279,9 +4533,9 @@
       </w:tcPr>
     </w:tblStylePr>
   </w:style>
-  <w:style w:type="table" w:styleId="Cuadrculaclara-nfasis6">
+  <w:style w:type="table" w:styleId="LightGrid-Accent6">
     <w:name w:val="Light Grid Accent 6"/>
-    <w:basedOn w:val="Tablanormal"/>
+    <w:basedOn w:val="TableNormal"/>
     <w:uiPriority w:val="62"/>
     <w:rsid w:val="00CB0664"/>
     <w:pPr>
@@ -4409,9 +4663,9 @@
       </w:tcPr>
     </w:tblStylePr>
   </w:style>
-  <w:style w:type="table" w:styleId="Sombreadomedio1">
+  <w:style w:type="table" w:styleId="MediumShading1">
     <w:name w:val="Medium Shading 1"/>
-    <w:basedOn w:val="Tablanormal"/>
+    <w:basedOn w:val="TableNormal"/>
     <w:uiPriority w:val="63"/>
     <w:rsid w:val="00CB0664"/>
     <w:pPr>
@@ -4515,9 +4769,9 @@
       </w:tcPr>
     </w:tblStylePr>
   </w:style>
-  <w:style w:type="table" w:styleId="Sombreadomedio1-nfasis1">
+  <w:style w:type="table" w:styleId="MediumShading1-Accent1">
     <w:name w:val="Medium Shading 1 Accent 1"/>
-    <w:basedOn w:val="Tablanormal"/>
+    <w:basedOn w:val="TableNormal"/>
     <w:uiPriority w:val="63"/>
     <w:rsid w:val="00CB0664"/>
     <w:pPr>
@@ -4621,9 +4875,9 @@
       </w:tcPr>
     </w:tblStylePr>
   </w:style>
-  <w:style w:type="table" w:styleId="Sombreadomedio1-nfasis2">
+  <w:style w:type="table" w:styleId="MediumShading1-Accent2">
     <w:name w:val="Medium Shading 1 Accent 2"/>
-    <w:basedOn w:val="Tablanormal"/>
+    <w:basedOn w:val="TableNormal"/>
     <w:uiPriority w:val="63"/>
     <w:rsid w:val="00CB0664"/>
     <w:pPr>
@@ -4727,9 +4981,9 @@
       </w:tcPr>
     </w:tblStylePr>
   </w:style>
-  <w:style w:type="table" w:styleId="Sombreadomedio1-nfasis3">
+  <w:style w:type="table" w:styleId="MediumShading1-Accent3">
     <w:name w:val="Medium Shading 1 Accent 3"/>
-    <w:basedOn w:val="Tablanormal"/>
+    <w:basedOn w:val="TableNormal"/>
     <w:uiPriority w:val="63"/>
     <w:rsid w:val="00CB0664"/>
     <w:pPr>
@@ -4833,9 +5087,9 @@
       </w:tcPr>
     </w:tblStylePr>
   </w:style>
-  <w:style w:type="table" w:styleId="Sombreadomedio1-nfasis4">
+  <w:style w:type="table" w:styleId="MediumShading1-Accent4">
     <w:name w:val="Medium Shading 1 Accent 4"/>
-    <w:basedOn w:val="Tablanormal"/>
+    <w:basedOn w:val="TableNormal"/>
     <w:uiPriority w:val="63"/>
     <w:rsid w:val="00CB0664"/>
     <w:pPr>
@@ -4939,9 +5193,9 @@
       </w:tcPr>
     </w:tblStylePr>
   </w:style>
-  <w:style w:type="table" w:styleId="Sombreadomedio1-nfasis5">
+  <w:style w:type="table" w:styleId="MediumShading1-Accent5">
     <w:name w:val="Medium Shading 1 Accent 5"/>
-    <w:basedOn w:val="Tablanormal"/>
+    <w:basedOn w:val="TableNormal"/>
     <w:uiPriority w:val="63"/>
     <w:rsid w:val="00CB0664"/>
     <w:pPr>
@@ -5045,9 +5299,9 @@
       </w:tcPr>
     </w:tblStylePr>
   </w:style>
-  <w:style w:type="table" w:styleId="Sombreadomedio1-nfasis6">
+  <w:style w:type="table" w:styleId="MediumShading1-Accent6">
     <w:name w:val="Medium Shading 1 Accent 6"/>
-    <w:basedOn w:val="Tablanormal"/>
+    <w:basedOn w:val="TableNormal"/>
     <w:uiPriority w:val="63"/>
     <w:rsid w:val="00CB0664"/>
     <w:pPr>
@@ -5151,9 +5405,9 @@
       </w:tcPr>
     </w:tblStylePr>
   </w:style>
-  <w:style w:type="table" w:styleId="Sombreadomedio2">
+  <w:style w:type="table" w:styleId="MediumShading2">
     <w:name w:val="Medium Shading 2"/>
-    <w:basedOn w:val="Tablanormal"/>
+    <w:basedOn w:val="TableNormal"/>
     <w:uiPriority w:val="64"/>
     <w:rsid w:val="00CB0664"/>
     <w:pPr>
@@ -5300,9 +5554,9 @@
       </w:tcPr>
     </w:tblStylePr>
   </w:style>
-  <w:style w:type="table" w:styleId="Sombreadomedio2-nfasis1">
+  <w:style w:type="table" w:styleId="MediumShading2-Accent1">
     <w:name w:val="Medium Shading 2 Accent 1"/>
-    <w:basedOn w:val="Tablanormal"/>
+    <w:basedOn w:val="TableNormal"/>
     <w:uiPriority w:val="64"/>
     <w:rsid w:val="00CB0664"/>
     <w:pPr>
@@ -5449,9 +5703,9 @@
       </w:tcPr>
     </w:tblStylePr>
   </w:style>
-  <w:style w:type="table" w:styleId="Sombreadomedio2-nfasis2">
+  <w:style w:type="table" w:styleId="MediumShading2-Accent2">
     <w:name w:val="Medium Shading 2 Accent 2"/>
-    <w:basedOn w:val="Tablanormal"/>
+    <w:basedOn w:val="TableNormal"/>
     <w:uiPriority w:val="64"/>
     <w:rsid w:val="00CB0664"/>
     <w:pPr>
@@ -5598,9 +5852,9 @@
       </w:tcPr>
     </w:tblStylePr>
   </w:style>
-  <w:style w:type="table" w:styleId="Sombreadomedio2-nfasis3">
+  <w:style w:type="table" w:styleId="MediumShading2-Accent3">
     <w:name w:val="Medium Shading 2 Accent 3"/>
-    <w:basedOn w:val="Tablanormal"/>
+    <w:basedOn w:val="TableNormal"/>
     <w:uiPriority w:val="64"/>
     <w:rsid w:val="00CB0664"/>
     <w:pPr>
@@ -5747,9 +6001,9 @@
       </w:tcPr>
     </w:tblStylePr>
   </w:style>
-  <w:style w:type="table" w:styleId="Sombreadomedio2-nfasis4">
+  <w:style w:type="table" w:styleId="MediumShading2-Accent4">
     <w:name w:val="Medium Shading 2 Accent 4"/>
-    <w:basedOn w:val="Tablanormal"/>
+    <w:basedOn w:val="TableNormal"/>
     <w:uiPriority w:val="64"/>
     <w:rsid w:val="00CB0664"/>
     <w:pPr>
@@ -5896,9 +6150,9 @@
       </w:tcPr>
     </w:tblStylePr>
   </w:style>
-  <w:style w:type="table" w:styleId="Sombreadomedio2-nfasis5">
+  <w:style w:type="table" w:styleId="MediumShading2-Accent5">
     <w:name w:val="Medium Shading 2 Accent 5"/>
-    <w:basedOn w:val="Tablanormal"/>
+    <w:basedOn w:val="TableNormal"/>
     <w:uiPriority w:val="64"/>
     <w:rsid w:val="00CB0664"/>
     <w:pPr>
@@ -6045,9 +6299,9 @@
       </w:tcPr>
     </w:tblStylePr>
   </w:style>
-  <w:style w:type="table" w:styleId="Sombreadomedio2-nfasis6">
+  <w:style w:type="table" w:styleId="MediumShading2-Accent6">
     <w:name w:val="Medium Shading 2 Accent 6"/>
-    <w:basedOn w:val="Tablanormal"/>
+    <w:basedOn w:val="TableNormal"/>
     <w:uiPriority w:val="64"/>
     <w:rsid w:val="00CB0664"/>
     <w:pPr>
@@ -6194,9 +6448,9 @@
       </w:tcPr>
     </w:tblStylePr>
   </w:style>
-  <w:style w:type="table" w:styleId="Listamedia1">
+  <w:style w:type="table" w:styleId="MediumList1">
     <w:name w:val="Medium List 1"/>
-    <w:basedOn w:val="Tablanormal"/>
+    <w:basedOn w:val="TableNormal"/>
     <w:uiPriority w:val="65"/>
     <w:rsid w:val="00CB0664"/>
     <w:pPr>
@@ -6278,9 +6532,9 @@
       </w:tcPr>
     </w:tblStylePr>
   </w:style>
-  <w:style w:type="table" w:styleId="Listamedia1-nfasis1">
+  <w:style w:type="table" w:styleId="MediumList1-Accent1">
     <w:name w:val="Medium List 1 Accent 1"/>
-    <w:basedOn w:val="Tablanormal"/>
+    <w:basedOn w:val="TableNormal"/>
     <w:uiPriority w:val="65"/>
     <w:rsid w:val="00CB0664"/>
     <w:pPr>
@@ -6362,9 +6616,9 @@
       </w:tcPr>
     </w:tblStylePr>
   </w:style>
-  <w:style w:type="table" w:styleId="Listamedia1-nfasis2">
+  <w:style w:type="table" w:styleId="MediumList1-Accent2">
     <w:name w:val="Medium List 1 Accent 2"/>
-    <w:basedOn w:val="Tablanormal"/>
+    <w:basedOn w:val="TableNormal"/>
     <w:uiPriority w:val="65"/>
     <w:rsid w:val="00CB0664"/>
     <w:pPr>
@@ -6446,9 +6700,9 @@
       </w:tcPr>
     </w:tblStylePr>
   </w:style>
-  <w:style w:type="table" w:styleId="Listamedia1-nfasis3">
+  <w:style w:type="table" w:styleId="MediumList1-Accent3">
     <w:name w:val="Medium List 1 Accent 3"/>
-    <w:basedOn w:val="Tablanormal"/>
+    <w:basedOn w:val="TableNormal"/>
     <w:uiPriority w:val="65"/>
     <w:rsid w:val="00CB0664"/>
     <w:pPr>
@@ -6530,9 +6784,9 @@
       </w:tcPr>
     </w:tblStylePr>
   </w:style>
-  <w:style w:type="table" w:styleId="Listamedia1-nfasis4">
+  <w:style w:type="table" w:styleId="MediumList1-Accent4">
     <w:name w:val="Medium List 1 Accent 4"/>
-    <w:basedOn w:val="Tablanormal"/>
+    <w:basedOn w:val="TableNormal"/>
     <w:uiPriority w:val="65"/>
     <w:rsid w:val="00CB0664"/>
     <w:pPr>
@@ -6614,9 +6868,9 @@
       </w:tcPr>
     </w:tblStylePr>
   </w:style>
-  <w:style w:type="table" w:styleId="Listamedia1-nfasis5">
+  <w:style w:type="table" w:styleId="MediumList1-Accent5">
     <w:name w:val="Medium List 1 Accent 5"/>
-    <w:basedOn w:val="Tablanormal"/>
+    <w:basedOn w:val="TableNormal"/>
     <w:uiPriority w:val="65"/>
     <w:rsid w:val="00CB0664"/>
     <w:pPr>
@@ -6698,9 +6952,9 @@
       </w:tcPr>
     </w:tblStylePr>
   </w:style>
-  <w:style w:type="table" w:styleId="Listamedia1-nfasis6">
+  <w:style w:type="table" w:styleId="MediumList1-Accent6">
     <w:name w:val="Medium List 1 Accent 6"/>
-    <w:basedOn w:val="Tablanormal"/>
+    <w:basedOn w:val="TableNormal"/>
     <w:uiPriority w:val="65"/>
     <w:rsid w:val="00CB0664"/>
     <w:pPr>
@@ -6782,9 +7036,9 @@
       </w:tcPr>
     </w:tblStylePr>
   </w:style>
-  <w:style w:type="table" w:styleId="Listamedia2">
+  <w:style w:type="table" w:styleId="MediumList2">
     <w:name w:val="Medium List 2"/>
-    <w:basedOn w:val="Tablanormal"/>
+    <w:basedOn w:val="TableNormal"/>
     <w:uiPriority w:val="66"/>
     <w:rsid w:val="00CB0664"/>
     <w:pPr>
@@ -6910,9 +7164,9 @@
       </w:tcPr>
     </w:tblStylePr>
   </w:style>
-  <w:style w:type="table" w:styleId="Listamedia2-nfasis1">
+  <w:style w:type="table" w:styleId="MediumList2-Accent1">
     <w:name w:val="Medium List 2 Accent 1"/>
-    <w:basedOn w:val="Tablanormal"/>
+    <w:basedOn w:val="TableNormal"/>
     <w:uiPriority w:val="66"/>
     <w:rsid w:val="00CB0664"/>
     <w:pPr>
@@ -7038,9 +7292,9 @@
       </w:tcPr>
     </w:tblStylePr>
   </w:style>
-  <w:style w:type="table" w:styleId="Listamedia2-nfasis2">
+  <w:style w:type="table" w:styleId="MediumList2-Accent2">
     <w:name w:val="Medium List 2 Accent 2"/>
-    <w:basedOn w:val="Tablanormal"/>
+    <w:basedOn w:val="TableNormal"/>
     <w:uiPriority w:val="66"/>
     <w:rsid w:val="00CB0664"/>
     <w:pPr>
@@ -7166,9 +7420,9 @@
       </w:tcPr>
     </w:tblStylePr>
   </w:style>
-  <w:style w:type="table" w:styleId="Listamedia2-nfasis3">
+  <w:style w:type="table" w:styleId="MediumList2-Accent3">
     <w:name w:val="Medium List 2 Accent 3"/>
-    <w:basedOn w:val="Tablanormal"/>
+    <w:basedOn w:val="TableNormal"/>
     <w:uiPriority w:val="66"/>
     <w:rsid w:val="00CB0664"/>
     <w:pPr>
@@ -7294,9 +7548,9 @@
       </w:tcPr>
     </w:tblStylePr>
   </w:style>
-  <w:style w:type="table" w:styleId="Listamedia2-nfasis4">
+  <w:style w:type="table" w:styleId="MediumList2-Accent4">
     <w:name w:val="Medium List 2 Accent 4"/>
-    <w:basedOn w:val="Tablanormal"/>
+    <w:basedOn w:val="TableNormal"/>
     <w:uiPriority w:val="66"/>
     <w:rsid w:val="00CB0664"/>
     <w:pPr>
@@ -7422,9 +7676,9 @@
       </w:tcPr>
     </w:tblStylePr>
   </w:style>
-  <w:style w:type="table" w:styleId="Listamedia2-nfasis5">
+  <w:style w:type="table" w:styleId="MediumList2-Accent5">
     <w:name w:val="Medium List 2 Accent 5"/>
-    <w:basedOn w:val="Tablanormal"/>
+    <w:basedOn w:val="TableNormal"/>
     <w:uiPriority w:val="66"/>
     <w:rsid w:val="00CB0664"/>
     <w:pPr>
@@ -7550,9 +7804,9 @@
       </w:tcPr>
     </w:tblStylePr>
   </w:style>
-  <w:style w:type="table" w:styleId="Listamedia2-nfasis6">
+  <w:style w:type="table" w:styleId="MediumList2-Accent6">
     <w:name w:val="Medium List 2 Accent 6"/>
-    <w:basedOn w:val="Tablanormal"/>
+    <w:basedOn w:val="TableNormal"/>
     <w:uiPriority w:val="66"/>
     <w:rsid w:val="00CB0664"/>
     <w:pPr>
@@ -7678,9 +7932,9 @@
       </w:tcPr>
     </w:tblStylePr>
   </w:style>
-  <w:style w:type="table" w:styleId="Cuadrculamedia1">
+  <w:style w:type="table" w:styleId="MediumGrid1">
     <w:name w:val="Medium Grid 1"/>
-    <w:basedOn w:val="Tablanormal"/>
+    <w:basedOn w:val="TableNormal"/>
     <w:uiPriority w:val="67"/>
     <w:rsid w:val="00CB0664"/>
     <w:pPr>
@@ -7751,9 +8005,9 @@
       </w:tcPr>
     </w:tblStylePr>
   </w:style>
-  <w:style w:type="table" w:styleId="Cuadrculamedia1-nfasis1">
+  <w:style w:type="table" w:styleId="MediumGrid1-Accent1">
     <w:name w:val="Medium Grid 1 Accent 1"/>
-    <w:basedOn w:val="Tablanormal"/>
+    <w:basedOn w:val="TableNormal"/>
     <w:uiPriority w:val="67"/>
     <w:rsid w:val="00CB0664"/>
     <w:pPr>
@@ -7824,9 +8078,9 @@
       </w:tcPr>
     </w:tblStylePr>
   </w:style>
-  <w:style w:type="table" w:styleId="Cuadrculamedia1-nfasis2">
+  <w:style w:type="table" w:styleId="MediumGrid1-Accent2">
     <w:name w:val="Medium Grid 1 Accent 2"/>
-    <w:basedOn w:val="Tablanormal"/>
+    <w:basedOn w:val="TableNormal"/>
     <w:uiPriority w:val="67"/>
     <w:rsid w:val="00CB0664"/>
     <w:pPr>
@@ -7897,9 +8151,9 @@
       </w:tcPr>
     </w:tblStylePr>
   </w:style>
-  <w:style w:type="table" w:styleId="Cuadrculamedia1-nfasis3">
+  <w:style w:type="table" w:styleId="MediumGrid1-Accent3">
     <w:name w:val="Medium Grid 1 Accent 3"/>
-    <w:basedOn w:val="Tablanormal"/>
+    <w:basedOn w:val="TableNormal"/>
     <w:uiPriority w:val="67"/>
     <w:rsid w:val="00CB0664"/>
     <w:pPr>
@@ -7970,9 +8224,9 @@
       </w:tcPr>
     </w:tblStylePr>
   </w:style>
-  <w:style w:type="table" w:styleId="Cuadrculamedia1-nfasis4">
+  <w:style w:type="table" w:styleId="MediumGrid1-Accent4">
     <w:name w:val="Medium Grid 1 Accent 4"/>
-    <w:basedOn w:val="Tablanormal"/>
+    <w:basedOn w:val="TableNormal"/>
     <w:uiPriority w:val="67"/>
     <w:rsid w:val="00CB0664"/>
     <w:pPr>
@@ -8043,9 +8297,9 @@
       </w:tcPr>
     </w:tblStylePr>
   </w:style>
-  <w:style w:type="table" w:styleId="Cuadrculamedia1-nfasis5">
+  <w:style w:type="table" w:styleId="MediumGrid1-Accent5">
     <w:name w:val="Medium Grid 1 Accent 5"/>
-    <w:basedOn w:val="Tablanormal"/>
+    <w:basedOn w:val="TableNormal"/>
     <w:uiPriority w:val="67"/>
     <w:rsid w:val="00CB0664"/>
     <w:pPr>
@@ -8116,9 +8370,9 @@
       </w:tcPr>
     </w:tblStylePr>
   </w:style>
-  <w:style w:type="table" w:styleId="Cuadrculamedia1-nfasis6">
+  <w:style w:type="table" w:styleId="MediumGrid1-Accent6">
     <w:name w:val="Medium Grid 1 Accent 6"/>
-    <w:basedOn w:val="Tablanormal"/>
+    <w:basedOn w:val="TableNormal"/>
     <w:uiPriority w:val="67"/>
     <w:rsid w:val="00CB0664"/>
     <w:pPr>
@@ -8189,9 +8443,9 @@
       </w:tcPr>
     </w:tblStylePr>
   </w:style>
-  <w:style w:type="table" w:styleId="Cuadrculamedia2">
+  <w:style w:type="table" w:styleId="MediumGrid2">
     <w:name w:val="Medium Grid 2"/>
-    <w:basedOn w:val="Tablanormal"/>
+    <w:basedOn w:val="TableNormal"/>
     <w:uiPriority w:val="68"/>
     <w:rsid w:val="00CB0664"/>
     <w:pPr>
@@ -8314,9 +8568,9 @@
       </w:tcPr>
     </w:tblStylePr>
   </w:style>
-  <w:style w:type="table" w:styleId="Cuadrculamedia2-nfasis1">
+  <w:style w:type="table" w:styleId="MediumGrid2-Accent1">
     <w:name w:val="Medium Grid 2 Accent 1"/>
-    <w:basedOn w:val="Tablanormal"/>
+    <w:basedOn w:val="TableNormal"/>
     <w:uiPriority w:val="68"/>
     <w:rsid w:val="00CB0664"/>
     <w:pPr>
@@ -8439,9 +8693,9 @@
       </w:tcPr>
     </w:tblStylePr>
   </w:style>
-  <w:style w:type="table" w:styleId="Cuadrculamedia2-nfasis2">
+  <w:style w:type="table" w:styleId="MediumGrid2-Accent2">
     <w:name w:val="Medium Grid 2 Accent 2"/>
-    <w:basedOn w:val="Tablanormal"/>
+    <w:basedOn w:val="TableNormal"/>
     <w:uiPriority w:val="68"/>
     <w:rsid w:val="00CB0664"/>
     <w:pPr>
@@ -8564,9 +8818,9 @@
       </w:tcPr>
     </w:tblStylePr>
   </w:style>
-  <w:style w:type="table" w:styleId="Cuadrculamedia2-nfasis3">
+  <w:style w:type="table" w:styleId="MediumGrid2-Accent3">
     <w:name w:val="Medium Grid 2 Accent 3"/>
-    <w:basedOn w:val="Tablanormal"/>
+    <w:basedOn w:val="TableNormal"/>
     <w:uiPriority w:val="68"/>
     <w:rsid w:val="00CB0664"/>
     <w:pPr>
@@ -8689,9 +8943,9 @@
       </w:tcPr>
     </w:tblStylePr>
   </w:style>
-  <w:style w:type="table" w:styleId="Cuadrculamedia2-nfasis4">
+  <w:style w:type="table" w:styleId="MediumGrid2-Accent4">
     <w:name w:val="Medium Grid 2 Accent 4"/>
-    <w:basedOn w:val="Tablanormal"/>
+    <w:basedOn w:val="TableNormal"/>
     <w:uiPriority w:val="68"/>
     <w:rsid w:val="00CB0664"/>
     <w:pPr>
@@ -8814,9 +9068,9 @@
       </w:tcPr>
     </w:tblStylePr>
   </w:style>
-  <w:style w:type="table" w:styleId="Cuadrculamedia2-nfasis5">
+  <w:style w:type="table" w:styleId="MediumGrid2-Accent5">
     <w:name w:val="Medium Grid 2 Accent 5"/>
-    <w:basedOn w:val="Tablanormal"/>
+    <w:basedOn w:val="TableNormal"/>
     <w:uiPriority w:val="68"/>
     <w:rsid w:val="00CB0664"/>
     <w:pPr>
@@ -8939,9 +9193,9 @@
       </w:tcPr>
     </w:tblStylePr>
   </w:style>
-  <w:style w:type="table" w:styleId="Cuadrculamedia2-nfasis6">
+  <w:style w:type="table" w:styleId="MediumGrid2-Accent6">
     <w:name w:val="Medium Grid 2 Accent 6"/>
-    <w:basedOn w:val="Tablanormal"/>
+    <w:basedOn w:val="TableNormal"/>
     <w:uiPriority w:val="68"/>
     <w:rsid w:val="00CB0664"/>
     <w:pPr>
@@ -9064,9 +9318,9 @@
       </w:tcPr>
     </w:tblStylePr>
   </w:style>
-  <w:style w:type="table" w:styleId="Cuadrculamedia3">
+  <w:style w:type="table" w:styleId="MediumGrid3">
     <w:name w:val="Medium Grid 3"/>
-    <w:basedOn w:val="Tablanormal"/>
+    <w:basedOn w:val="TableNormal"/>
     <w:uiPriority w:val="69"/>
     <w:rsid w:val="00CB0664"/>
     <w:pPr>
@@ -9205,9 +9459,9 @@
       </w:tcPr>
     </w:tblStylePr>
   </w:style>
-  <w:style w:type="table" w:styleId="Cuadrculamedia3-nfasis1">
+  <w:style w:type="table" w:styleId="MediumGrid3-Accent1">
     <w:name w:val="Medium Grid 3 Accent 1"/>
-    <w:basedOn w:val="Tablanormal"/>
+    <w:basedOn w:val="TableNormal"/>
     <w:uiPriority w:val="69"/>
     <w:rsid w:val="00CB0664"/>
     <w:pPr>
@@ -9346,9 +9600,9 @@
       </w:tcPr>
     </w:tblStylePr>
   </w:style>
-  <w:style w:type="table" w:styleId="Cuadrculamedia3-nfasis2">
+  <w:style w:type="table" w:styleId="MediumGrid3-Accent2">
     <w:name w:val="Medium Grid 3 Accent 2"/>
-    <w:basedOn w:val="Tablanormal"/>
+    <w:basedOn w:val="TableNormal"/>
     <w:uiPriority w:val="69"/>
     <w:rsid w:val="00CB0664"/>
     <w:pPr>
@@ -9487,9 +9741,9 @@
       </w:tcPr>
     </w:tblStylePr>
   </w:style>
-  <w:style w:type="table" w:styleId="Cuadrculamedia3-nfasis3">
+  <w:style w:type="table" w:styleId="MediumGrid3-Accent3">
     <w:name w:val="Medium Grid 3 Accent 3"/>
-    <w:basedOn w:val="Tablanormal"/>
+    <w:basedOn w:val="TableNormal"/>
     <w:uiPriority w:val="69"/>
     <w:rsid w:val="00CB0664"/>
     <w:pPr>
@@ -9628,9 +9882,9 @@
       </w:tcPr>
     </w:tblStylePr>
   </w:style>
-  <w:style w:type="table" w:styleId="Cuadrculamedia3-nfasis4">
+  <w:style w:type="table" w:styleId="MediumGrid3-Accent4">
     <w:name w:val="Medium Grid 3 Accent 4"/>
-    <w:basedOn w:val="Tablanormal"/>
+    <w:basedOn w:val="TableNormal"/>
     <w:uiPriority w:val="69"/>
     <w:rsid w:val="00CB0664"/>
     <w:pPr>
@@ -9769,9 +10023,9 @@
       </w:tcPr>
     </w:tblStylePr>
   </w:style>
-  <w:style w:type="table" w:styleId="Cuadrculamedia3-nfasis5">
+  <w:style w:type="table" w:styleId="MediumGrid3-Accent5">
     <w:name w:val="Medium Grid 3 Accent 5"/>
-    <w:basedOn w:val="Tablanormal"/>
+    <w:basedOn w:val="TableNormal"/>
     <w:uiPriority w:val="69"/>
     <w:rsid w:val="00CB0664"/>
     <w:pPr>
@@ -9910,9 +10164,9 @@
       </w:tcPr>
     </w:tblStylePr>
   </w:style>
-  <w:style w:type="table" w:styleId="Cuadrculamedia3-nfasis6">
+  <w:style w:type="table" w:styleId="MediumGrid3-Accent6">
     <w:name w:val="Medium Grid 3 Accent 6"/>
-    <w:basedOn w:val="Tablanormal"/>
+    <w:basedOn w:val="TableNormal"/>
     <w:uiPriority w:val="69"/>
     <w:rsid w:val="00CB0664"/>
     <w:pPr>
@@ -10051,9 +10305,9 @@
       </w:tcPr>
     </w:tblStylePr>
   </w:style>
-  <w:style w:type="table" w:styleId="Listaoscura">
+  <w:style w:type="table" w:styleId="DarkList">
     <w:name w:val="Dark List"/>
-    <w:basedOn w:val="Tablanormal"/>
+    <w:basedOn w:val="TableNormal"/>
     <w:uiPriority w:val="70"/>
     <w:rsid w:val="00CB0664"/>
     <w:pPr>
@@ -10165,9 +10419,9 @@
       </w:tcPr>
     </w:tblStylePr>
   </w:style>
-  <w:style w:type="table" w:styleId="Listaoscura-nfasis1">
+  <w:style w:type="table" w:styleId="DarkList-Accent1">
     <w:name w:val="Dark List Accent 1"/>
-    <w:basedOn w:val="Tablanormal"/>
+    <w:basedOn w:val="TableNormal"/>
     <w:uiPriority w:val="70"/>
     <w:rsid w:val="00CB0664"/>
     <w:pPr>
@@ -10279,9 +10533,9 @@
       </w:tcPr>
     </w:tblStylePr>
   </w:style>
-  <w:style w:type="table" w:styleId="Listaoscura-nfasis2">
+  <w:style w:type="table" w:styleId="DarkList-Accent2">
     <w:name w:val="Dark List Accent 2"/>
-    <w:basedOn w:val="Tablanormal"/>
+    <w:basedOn w:val="TableNormal"/>
     <w:uiPriority w:val="70"/>
     <w:rsid w:val="00CB0664"/>
     <w:pPr>
@@ -10393,9 +10647,9 @@
       </w:tcPr>
     </w:tblStylePr>
   </w:style>
-  <w:style w:type="table" w:styleId="Listaoscura-nfasis3">
+  <w:style w:type="table" w:styleId="DarkList-Accent3">
     <w:name w:val="Dark List Accent 3"/>
-    <w:basedOn w:val="Tablanormal"/>
+    <w:basedOn w:val="TableNormal"/>
     <w:uiPriority w:val="70"/>
     <w:rsid w:val="00CB0664"/>
     <w:pPr>
@@ -10507,9 +10761,9 @@
       </w:tcPr>
     </w:tblStylePr>
   </w:style>
-  <w:style w:type="table" w:styleId="Listaoscura-nfasis4">
+  <w:style w:type="table" w:styleId="DarkList-Accent4">
     <w:name w:val="Dark List Accent 4"/>
-    <w:basedOn w:val="Tablanormal"/>
+    <w:basedOn w:val="TableNormal"/>
     <w:uiPriority w:val="70"/>
     <w:rsid w:val="00CB0664"/>
     <w:pPr>
@@ -10621,9 +10875,9 @@
       </w:tcPr>
     </w:tblStylePr>
   </w:style>
-  <w:style w:type="table" w:styleId="Listaoscura-nfasis5">
+  <w:style w:type="table" w:styleId="DarkList-Accent5">
     <w:name w:val="Dark List Accent 5"/>
-    <w:basedOn w:val="Tablanormal"/>
+    <w:basedOn w:val="TableNormal"/>
     <w:uiPriority w:val="70"/>
     <w:rsid w:val="00CB0664"/>
     <w:pPr>
@@ -10735,9 +10989,9 @@
       </w:tcPr>
     </w:tblStylePr>
   </w:style>
-  <w:style w:type="table" w:styleId="Listaoscura-nfasis6">
+  <w:style w:type="table" w:styleId="DarkList-Accent6">
     <w:name w:val="Dark List Accent 6"/>
-    <w:basedOn w:val="Tablanormal"/>
+    <w:basedOn w:val="TableNormal"/>
     <w:uiPriority w:val="70"/>
     <w:rsid w:val="00CB0664"/>
     <w:pPr>
@@ -10849,9 +11103,9 @@
       </w:tcPr>
     </w:tblStylePr>
   </w:style>
-  <w:style w:type="table" w:styleId="Sombreadovistoso">
+  <w:style w:type="table" w:styleId="ColorfulShading">
     <w:name w:val="Colorful Shading"/>
-    <w:basedOn w:val="Tablanormal"/>
+    <w:basedOn w:val="TableNormal"/>
     <w:uiPriority w:val="71"/>
     <w:rsid w:val="00CB0664"/>
     <w:pPr>
@@ -10971,9 +11225,9 @@
       </w:rPr>
     </w:tblStylePr>
   </w:style>
-  <w:style w:type="table" w:styleId="Sombreadovistoso-nfasis1">
+  <w:style w:type="table" w:styleId="ColorfulShading-Accent1">
     <w:name w:val="Colorful Shading Accent 1"/>
-    <w:basedOn w:val="Tablanormal"/>
+    <w:basedOn w:val="TableNormal"/>
     <w:uiPriority w:val="71"/>
     <w:rsid w:val="00CB0664"/>
     <w:pPr>
@@ -11093,9 +11347,9 @@
       </w:rPr>
     </w:tblStylePr>
   </w:style>
-  <w:style w:type="table" w:styleId="Sombreadovistoso-nfasis2">
+  <w:style w:type="table" w:styleId="ColorfulShading-Accent2">
     <w:name w:val="Colorful Shading Accent 2"/>
-    <w:basedOn w:val="Tablanormal"/>
+    <w:basedOn w:val="TableNormal"/>
     <w:uiPriority w:val="71"/>
     <w:rsid w:val="00CB0664"/>
     <w:pPr>
@@ -11215,9 +11469,9 @@
       </w:rPr>
     </w:tblStylePr>
   </w:style>
-  <w:style w:type="table" w:styleId="Sombreadovistoso-nfasis3">
+  <w:style w:type="table" w:styleId="ColorfulShading-Accent3">
     <w:name w:val="Colorful Shading Accent 3"/>
-    <w:basedOn w:val="Tablanormal"/>
+    <w:basedOn w:val="TableNormal"/>
     <w:uiPriority w:val="71"/>
     <w:rsid w:val="00CB0664"/>
     <w:pPr>
@@ -11327,9 +11581,9 @@
       </w:tcPr>
     </w:tblStylePr>
   </w:style>
-  <w:style w:type="table" w:styleId="Sombreadovistoso-nfasis4">
+  <w:style w:type="table" w:styleId="ColorfulShading-Accent4">
     <w:name w:val="Colorful Shading Accent 4"/>
-    <w:basedOn w:val="Tablanormal"/>
+    <w:basedOn w:val="TableNormal"/>
     <w:uiPriority w:val="71"/>
     <w:rsid w:val="00CB0664"/>
     <w:pPr>
@@ -11449,9 +11703,9 @@
       </w:rPr>
     </w:tblStylePr>
   </w:style>
-  <w:style w:type="table" w:styleId="Sombreadovistoso-nfasis5">
+  <w:style w:type="table" w:styleId="ColorfulShading-Accent5">
     <w:name w:val="Colorful Shading Accent 5"/>
-    <w:basedOn w:val="Tablanormal"/>
+    <w:basedOn w:val="TableNormal"/>
     <w:uiPriority w:val="71"/>
     <w:rsid w:val="00CB0664"/>
     <w:pPr>
@@ -11571,9 +11825,9 @@
       </w:rPr>
     </w:tblStylePr>
   </w:style>
-  <w:style w:type="table" w:styleId="Sombreadovistoso-nfasis6">
+  <w:style w:type="table" w:styleId="ColorfulShading-Accent6">
     <w:name w:val="Colorful Shading Accent 6"/>
-    <w:basedOn w:val="Tablanormal"/>
+    <w:basedOn w:val="TableNormal"/>
     <w:uiPriority w:val="71"/>
     <w:rsid w:val="00CB0664"/>
     <w:pPr>
@@ -11693,9 +11947,9 @@
       </w:rPr>
     </w:tblStylePr>
   </w:style>
-  <w:style w:type="table" w:styleId="Listavistosa">
+  <w:style w:type="table" w:styleId="ColorfulList">
     <w:name w:val="Colorful List"/>
-    <w:basedOn w:val="Tablanormal"/>
+    <w:basedOn w:val="TableNormal"/>
     <w:uiPriority w:val="72"/>
     <w:rsid w:val="00CB0664"/>
     <w:pPr>
@@ -11779,9 +12033,9 @@
       </w:tcPr>
     </w:tblStylePr>
   </w:style>
-  <w:style w:type="table" w:styleId="Listavistosa-nfasis1">
+  <w:style w:type="table" w:styleId="ColorfulList-Accent1">
     <w:name w:val="Colorful List Accent 1"/>
-    <w:basedOn w:val="Tablanormal"/>
+    <w:basedOn w:val="TableNormal"/>
     <w:uiPriority w:val="72"/>
     <w:rsid w:val="00CB0664"/>
     <w:pPr>
@@ -11865,9 +12119,9 @@
       </w:tcPr>
     </w:tblStylePr>
   </w:style>
-  <w:style w:type="table" w:styleId="Listavistosa-nfasis2">
+  <w:style w:type="table" w:styleId="ColorfulList-Accent2">
     <w:name w:val="Colorful List Accent 2"/>
-    <w:basedOn w:val="Tablanormal"/>
+    <w:basedOn w:val="TableNormal"/>
     <w:uiPriority w:val="72"/>
     <w:rsid w:val="00CB0664"/>
     <w:pPr>
@@ -11951,9 +12205,9 @@
       </w:tcPr>
     </w:tblStylePr>
   </w:style>
-  <w:style w:type="table" w:styleId="Listavistosa-nfasis3">
+  <w:style w:type="table" w:styleId="ColorfulList-Accent3">
     <w:name w:val="Colorful List Accent 3"/>
-    <w:basedOn w:val="Tablanormal"/>
+    <w:basedOn w:val="TableNormal"/>
     <w:uiPriority w:val="72"/>
     <w:rsid w:val="00CB0664"/>
     <w:pPr>
@@ -12037,9 +12291,9 @@
       </w:tcPr>
     </w:tblStylePr>
   </w:style>
-  <w:style w:type="table" w:styleId="Listavistosa-nfasis4">
+  <w:style w:type="table" w:styleId="ColorfulList-Accent4">
     <w:name w:val="Colorful List Accent 4"/>
-    <w:basedOn w:val="Tablanormal"/>
+    <w:basedOn w:val="TableNormal"/>
     <w:uiPriority w:val="72"/>
     <w:rsid w:val="00CB0664"/>
     <w:pPr>
@@ -12123,9 +12377,9 @@
       </w:tcPr>
     </w:tblStylePr>
   </w:style>
-  <w:style w:type="table" w:styleId="Listavistosa-nfasis5">
+  <w:style w:type="table" w:styleId="ColorfulList-Accent5">
     <w:name w:val="Colorful List Accent 5"/>
-    <w:basedOn w:val="Tablanormal"/>
+    <w:basedOn w:val="TableNormal"/>
     <w:uiPriority w:val="72"/>
     <w:rsid w:val="00CB0664"/>
     <w:pPr>
@@ -12209,9 +12463,9 @@
       </w:tcPr>
     </w:tblStylePr>
   </w:style>
-  <w:style w:type="table" w:styleId="Listavistosa-nfasis6">
+  <w:style w:type="table" w:styleId="ColorfulList-Accent6">
     <w:name w:val="Colorful List Accent 6"/>
-    <w:basedOn w:val="Tablanormal"/>
+    <w:basedOn w:val="TableNormal"/>
     <w:uiPriority w:val="72"/>
     <w:rsid w:val="00CB0664"/>
     <w:pPr>
@@ -12295,9 +12549,9 @@
       </w:tcPr>
     </w:tblStylePr>
   </w:style>
-  <w:style w:type="table" w:styleId="Cuadrculavistosa">
+  <w:style w:type="table" w:styleId="ColorfulGrid">
     <w:name w:val="Colorful Grid"/>
-    <w:basedOn w:val="Tablanormal"/>
+    <w:basedOn w:val="TableNormal"/>
     <w:uiPriority w:val="73"/>
     <w:rsid w:val="00CB0664"/>
     <w:pPr>
@@ -12375,9 +12629,9 @@
       </w:tcPr>
     </w:tblStylePr>
   </w:style>
-  <w:style w:type="table" w:styleId="Cuadrculavistosa-nfasis1">
+  <w:style w:type="table" w:styleId="ColorfulGrid-Accent1">
     <w:name w:val="Colorful Grid Accent 1"/>
-    <w:basedOn w:val="Tablanormal"/>
+    <w:basedOn w:val="TableNormal"/>
     <w:uiPriority w:val="73"/>
     <w:rsid w:val="00CB0664"/>
     <w:pPr>
@@ -12455,9 +12709,9 @@
       </w:tcPr>
     </w:tblStylePr>
   </w:style>
-  <w:style w:type="table" w:styleId="Cuadrculavistosa-nfasis2">
+  <w:style w:type="table" w:styleId="ColorfulGrid-Accent2">
     <w:name w:val="Colorful Grid Accent 2"/>
-    <w:basedOn w:val="Tablanormal"/>
+    <w:basedOn w:val="TableNormal"/>
     <w:uiPriority w:val="73"/>
     <w:rsid w:val="00CB0664"/>
     <w:pPr>
@@ -12535,9 +12789,9 @@
       </w:tcPr>
     </w:tblStylePr>
   </w:style>
-  <w:style w:type="table" w:styleId="Cuadrculavistosa-nfasis3">
+  <w:style w:type="table" w:styleId="ColorfulGrid-Accent3">
     <w:name w:val="Colorful Grid Accent 3"/>
-    <w:basedOn w:val="Tablanormal"/>
+    <w:basedOn w:val="TableNormal"/>
     <w:uiPriority w:val="73"/>
     <w:rsid w:val="00CB0664"/>
     <w:pPr>
@@ -12615,9 +12869,9 @@
       </w:tcPr>
     </w:tblStylePr>
   </w:style>
-  <w:style w:type="table" w:styleId="Cuadrculavistosa-nfasis4">
+  <w:style w:type="table" w:styleId="ColorfulGrid-Accent4">
     <w:name w:val="Colorful Grid Accent 4"/>
-    <w:basedOn w:val="Tablanormal"/>
+    <w:basedOn w:val="TableNormal"/>
     <w:uiPriority w:val="73"/>
     <w:rsid w:val="00CB0664"/>
     <w:pPr>
@@ -12695,9 +12949,9 @@
       </w:tcPr>
     </w:tblStylePr>
   </w:style>
-  <w:style w:type="table" w:styleId="Cuadrculavistosa-nfasis5">
+  <w:style w:type="table" w:styleId="ColorfulGrid-Accent5">
     <w:name w:val="Colorful Grid Accent 5"/>
-    <w:basedOn w:val="Tablanormal"/>
+    <w:basedOn w:val="TableNormal"/>
     <w:uiPriority w:val="73"/>
     <w:rsid w:val="00CB0664"/>
     <w:pPr>
@@ -12775,9 +13029,9 @@
       </w:tcPr>
     </w:tblStylePr>
   </w:style>
-  <w:style w:type="table" w:styleId="Cuadrculavistosa-nfasis6">
+  <w:style w:type="table" w:styleId="ColorfulGrid-Accent6">
     <w:name w:val="Colorful Grid Accent 6"/>
-    <w:basedOn w:val="Tablanormal"/>
+    <w:basedOn w:val="TableNormal"/>
     <w:uiPriority w:val="73"/>
     <w:rsid w:val="00CB0664"/>
     <w:pPr>
@@ -24985,7 +25239,7 @@
 </file>
 
 <file path=customXml/itemProps1.xml><?xml version="1.0" encoding="utf-8"?>
-<ds:datastoreItem xmlns:ds="http://schemas.openxmlformats.org/officeDocument/2006/customXml" ds:itemID="{B22731ED-8D3A-4035-99AA-145DBFCD8364}">
+<ds:datastoreItem xmlns:ds="http://schemas.openxmlformats.org/officeDocument/2006/customXml" ds:itemID="{EF278816-EC6F-A645-907D-7F25AECB1D4A}">
   <ds:schemaRefs>
     <ds:schemaRef ds:uri="http://schemas.openxmlformats.org/officeDocument/2006/bibliography"/>
   </ds:schemaRefs>

</xml_diff>